<commit_message>
v8.2: register and documents moved to legacy CPAT 1.0pre_465
Row map 456->465 and remap tool; fix plans and register sources remapped and
checked against 465; register v8.2 with the status in legacy of every bug
(CPAT team's fixes: Appendix C confirmed, Appendix B caveats / not fixed);
In legacy 465 columns in BUGS.md, LegacyBugFixes.md and the register
spreadsheet; tracker refreshed. Release v8.2 (workbook formulas unchanged:
quick check 0 change vs v8.1, paste test PASS), deck and Word documentation
rebuilt; tidy-up of bugsfixed/, NORMS, TODO, READMEs, CHANGELOG.

Co-Authored-By: Claude Opus 5.5 <noreply@anthropic.com>
Claude-Session: https://claude.ai/code/session_01NEaWSMCoGDPkcQwasoKLW3
</commit_message>
<xml_diff>
--- a/excel_ai/mitigation/CPAT-AI-Mitigation_Documentation.docx
+++ b/excel_ai/mitigation/CPAT-AI-Mitigation_Documentation.docx
@@ -25,7 +25,7 @@
         <w:t xml:space="preserve"> </w:t>
       </w:r>
       <w:r>
-        <w:t xml:space="preserve">v8.0</w:t>
+        <w:t xml:space="preserve">v8.2</w:t>
       </w:r>
     </w:p>
     <w:p>
@@ -41,7 +41,7 @@
         <w:pStyle w:val="Date"/>
       </w:pPr>
       <w:r>
-        <w:t xml:space="preserve">2026-10-22</w:t>
+        <w:t xml:space="preserve">2026-10-23</w:t>
       </w:r>
     </w:p>
     <w:sdt>
@@ -1782,7 +1782,68 @@
         <w:t xml:space="preserve">CPAT-AI_BugsAndIssues_latest.docx</w:t>
       </w:r>
       <w:r>
-        <w:t xml:space="preserve">, gives each bug and its cell-level fix for legacy CPAT.</w:t>
+        <w:t xml:space="preserve">, gives each bug and its cell-level fix for legacy CPAT. Its cell references are rows of the latest legacy file,</w:t>
+      </w:r>
+      <w:r>
+        <w:t xml:space="preserve"> </w:t>
+      </w:r>
+      <w:r>
+        <w:rPr>
+          <w:rStyle w:val="VerbatimChar"/>
+        </w:rPr>
+        <w:t xml:space="preserve">CPAT 1.0pre_465</w:t>
+      </w:r>
+      <w:r>
+        <w:t xml:space="preserve">, where the CPAT team marked 62 of the bugs fixed (52 confirmed, 8 with caveats, 2 not fixed); the register gives each bug’s status in legacy.</w:t>
+      </w:r>
+    </w:p>
+    <w:p>
+      <w:pPr>
+        <w:numPr>
+          <w:ilvl w:val="0"/>
+          <w:numId w:val="1005"/>
+        </w:numPr>
+        <w:pStyle w:val="Compact"/>
+      </w:pPr>
+      <w:r>
+        <w:rPr>
+          <w:bCs/>
+          <w:b/>
+        </w:rPr>
+        <w:t xml:space="preserve">Legacy row numbers in the Methods volume</w:t>
+      </w:r>
+      <w:r>
+        <w:t xml:space="preserve"> </w:t>
+      </w:r>
+      <w:r>
+        <w:t xml:space="preserve">are rows of</w:t>
+      </w:r>
+      <w:r>
+        <w:t xml:space="preserve"> </w:t>
+      </w:r>
+      <w:r>
+        <w:rPr>
+          <w:rStyle w:val="VerbatimChar"/>
+        </w:rPr>
+        <w:t xml:space="preserve">CPAT 1.0pre_456_NoPropData.xlsb</w:t>
+      </w:r>
+      <w:r>
+        <w:t xml:space="preserve">, the file the prototype was built and checked against (its data extracts read that file). In</w:t>
+      </w:r>
+      <w:r>
+        <w:t xml:space="preserve"> </w:t>
+      </w:r>
+      <w:r>
+        <w:rPr>
+          <w:rStyle w:val="VerbatimChar"/>
+        </w:rPr>
+        <w:t xml:space="preserve">CPAT 1.0pre_465</w:t>
+      </w:r>
+      <w:r>
+        <w:t xml:space="preserve"> </w:t>
+      </w:r>
+      <w:r>
+        <w:t xml:space="preserve">Mitigation rows from 5667 on sit 11 to 15 rows higher.</w:t>
       </w:r>
     </w:p>
     <w:p>

</xml_diff>

<commit_message>
v8.3: to-do leftovers; legacy bug L134 fixed in the prototype
TODO tidy (CPAT-team items merged, coded/TODO names); register spreadsheet
built from the register itself (identical table); excel_lint.check() after
every save of every Excel writer; leads closed (Manual inputs J178:J179 are
read; NOx forcing explained by the fixed L22/L23/L58/L59); new legacy bug
L134 (price-increase unit labels) fixed in ScenarioDefinition. Release v8.3:
quick check 0 change vs v8.2, paste test PASS; documents, tracker and deck
regenerated.

Co-Authored-By: Claude Opus 5.5 <noreply@anthropic.com>
Claude-Session: https://claude.ai/code/session_01NEaWSMCoGDPkcQwasoKLW3
</commit_message>
<xml_diff>
--- a/excel_ai/mitigation/CPAT-AI-Mitigation_Documentation.docx
+++ b/excel_ai/mitigation/CPAT-AI-Mitigation_Documentation.docx
@@ -25,7 +25,7 @@
         <w:t xml:space="preserve"> </w:t>
       </w:r>
       <w:r>
-        <w:t xml:space="preserve">v8.2</w:t>
+        <w:t xml:space="preserve">v8.3</w:t>
       </w:r>
     </w:p>
     <w:p>
@@ -1770,7 +1770,7 @@
         <w:t xml:space="preserve"> </w:t>
       </w:r>
       <w:r>
-        <w:t xml:space="preserve">the prototype fixes every one (131 in mitigation, 31 in distribution). The bug-fix register,</w:t>
+        <w:t xml:space="preserve">the prototype fixes every one (132 in mitigation, 31 in distribution). The bug-fix register,</w:t>
       </w:r>
       <w:r>
         <w:t xml:space="preserve"> </w:t>

</xml_diff>

<commit_message>
Register documents regenerated for v0.9.2 (BUGS.md, ISSUES.md, tracker, bugs document, codes map, Word documentation, Formulas.md)
make_codesmap.py skips the Coded CPAT input files retired in phase 6.3.

Co-Authored-By: Claude Opus 5.5 <noreply@anthropic.com>
Claude-Session: https://claude.ai/code/session_01VSHkeKHvEpgMbAi9EGXtF1
</commit_message>
<xml_diff>
--- a/excel_ai/mitigation/CPAT-AI-Mitigation_Documentation.docx
+++ b/excel_ai/mitigation/CPAT-AI-Mitigation_Documentation.docx
@@ -25,7 +25,7 @@
         <w:t xml:space="preserve"> </w:t>
       </w:r>
       <w:r>
-        <w:t xml:space="preserve">v9.0</w:t>
+        <w:t xml:space="preserve">v0.9.2</w:t>
       </w:r>
     </w:p>
     <w:p>
@@ -2000,7 +2000,7 @@
         <w:rPr>
           <w:rStyle w:val="VerbatimChar"/>
         </w:rPr>
-        <w:t xml:space="preserve">excel_ai/Tracking_Legacy_Bugs_v9.0.xlsx</w:t>
+        <w:t xml:space="preserve">excel_ai/Tracking_Legacy_Bugs_v0.9.2.xlsx</w:t>
       </w:r>
       <w:r>
         <w:t xml:space="preserve"> </w:t>
@@ -2015,10 +2015,10 @@
         <w:rPr>
           <w:rStyle w:val="VerbatimChar"/>
         </w:rPr>
-        <w:t xml:space="preserve">excel_ai/Legacy_CPAT_Bugs_v9.0.docx</w:t>
-      </w:r>
-      <w:r>
-        <w:t xml:space="preserve">, the rest in these appendices. Codes renumbered in v8.4 give their former code.</w:t>
+        <w:t xml:space="preserve">excel_ai/Legacy_CPAT_Bugs_v0.9.2.docx</w:t>
+      </w:r>
+      <w:r>
+        <w:t xml:space="preserve">, the rest in these appendices. Codes renumbered in v0.8.4 give their former code.</w:t>
       </w:r>
     </w:p>
     <w:tbl>
@@ -2121,7 +2121,7 @@
               <w:jc w:val="left"/>
             </w:pPr>
             <w:r>
-              <w:t xml:space="preserve">222</w:t>
+              <w:t xml:space="preserve">227</w:t>
             </w:r>
           </w:p>
         </w:tc>
@@ -2183,31 +2183,31 @@
               <w:jc w:val="left"/>
             </w:pPr>
             <w:r>
-              <w:t xml:space="preserve">14</w:t>
-            </w:r>
-          </w:p>
-        </w:tc>
-        <w:tc>
-          <w:tcPr/>
-          <w:p>
-            <w:pPr>
-              <w:pStyle w:val="Compact"/>
-              <w:jc w:val="left"/>
-            </w:pPr>
-            <w:r>
-              <w:t xml:space="preserve">Prototype bug: a defect of the prototype itself, found and fixed during development.</w:t>
-            </w:r>
-          </w:p>
-        </w:tc>
-        <w:tc>
-          <w:tcPr/>
-          <w:p>
-            <w:pPr>
-              <w:pStyle w:val="Compact"/>
-              <w:jc w:val="left"/>
-            </w:pPr>
-            <w:r>
-              <w:t xml:space="preserve">Fixed.</w:t>
+              <w:t xml:space="preserve">22</w:t>
+            </w:r>
+          </w:p>
+        </w:tc>
+        <w:tc>
+          <w:tcPr/>
+          <w:p>
+            <w:pPr>
+              <w:pStyle w:val="Compact"/>
+              <w:jc w:val="left"/>
+            </w:pPr>
+            <w:r>
+              <w:t xml:space="preserve">Prototype bug: a defect of the prototype itself, found during development or by Coded CPAT’s replication (user 2026-10-29).</w:t>
+            </w:r>
+          </w:p>
+        </w:tc>
+        <w:tc>
+          <w:tcPr/>
+          <w:p>
+            <w:pPr>
+              <w:pStyle w:val="Compact"/>
+              <w:jc w:val="left"/>
+            </w:pPr>
+            <w:r>
+              <w:t xml:space="preserve">Fixed; an open one is listed with its fix, and Coded CPAT replicates it until the prototype is fixed.</w:t>
             </w:r>
           </w:p>
         </w:tc>
@@ -2233,6 +2233,68 @@
               <w:jc w:val="left"/>
             </w:pPr>
             <w:r>
+              <w:t xml:space="preserve">DOC</w:t>
+            </w:r>
+          </w:p>
+        </w:tc>
+        <w:tc>
+          <w:tcPr/>
+          <w:p>
+            <w:pPr>
+              <w:pStyle w:val="Compact"/>
+              <w:jc w:val="left"/>
+            </w:pPr>
+            <w:r>
+              <w:t xml:space="preserve">20</w:t>
+            </w:r>
+          </w:p>
+        </w:tc>
+        <w:tc>
+          <w:tcPr/>
+          <w:p>
+            <w:pPr>
+              <w:pStyle w:val="Compact"/>
+              <w:jc w:val="left"/>
+            </w:pPr>
+            <w:r>
+              <w:t xml:space="preserve">Documentation bug: the CPAT methodology documentation is wrong, missing or contradicts itself (an equation, a sign, a symbol, a unit, a reference); the models are not affected (user 2026-10-29).</w:t>
+            </w:r>
+          </w:p>
+        </w:tc>
+        <w:tc>
+          <w:tcPr/>
+          <w:p>
+            <w:pPr>
+              <w:pStyle w:val="Compact"/>
+              <w:jc w:val="left"/>
+            </w:pPr>
+            <w:r>
+              <w:t xml:space="preserve">Follows the workbooks; the documentation is to be corrected.</w:t>
+            </w:r>
+          </w:p>
+        </w:tc>
+        <w:tc>
+          <w:tcPr/>
+          <w:p>
+            <w:pPr>
+              <w:pStyle w:val="Compact"/>
+              <w:jc w:val="left"/>
+            </w:pPr>
+            <w:r>
+              <w:t xml:space="preserve">Register; methodology documentation (docs/01_MainDocumentation)</w:t>
+            </w:r>
+          </w:p>
+        </w:tc>
+      </w:tr>
+      <w:tr>
+        <w:tc>
+          <w:tcPr/>
+          <w:p>
+            <w:pPr>
+              <w:pStyle w:val="Compact"/>
+              <w:jc w:val="left"/>
+            </w:pPr>
+            <w:r>
               <w:t xml:space="preserve">I</w:t>
             </w:r>
           </w:p>
@@ -2245,7 +2307,7 @@
               <w:jc w:val="left"/>
             </w:pPr>
             <w:r>
-              <w:t xml:space="preserve">134</w:t>
+              <w:t xml:space="preserve">135</w:t>
             </w:r>
           </w:p>
         </w:tc>
@@ -2462,7 +2524,7 @@
         <w:t xml:space="preserve"> </w:t>
       </w:r>
       <w:r>
-        <w:t xml:space="preserve">Legacy 465 builds every combustion emission factor (local pollutants; the prototype also combustion CH4) as a line from the GAINS base factor (sheet EF_PM, FE in) in the base year to the final factor of switch EFSel in 2039 (Constant: FE in; Variable: FE fin; Average, the default: their mean), extrapolated after 2039 (Mitigation rows 1052-1663, columns L, AC, AD-AE). The yearly GAINS paths are not used. Until v8.4 the prototype ended at FE fin and stayed flat (data bug DB1, which wrongly said legacy reads zero paths); v8.5 aligns it with legacy (EFFinShare, EFWEIGHT, NONCO2).</w:t>
+        <w:t xml:space="preserve">Legacy 465 builds every combustion emission factor (local pollutants; the prototype also combustion CH4) as a line from the GAINS base factor (sheet EF_PM, FE in) in the base year to the final factor of switch EFSel in 2039 (Constant: FE in; Variable: FE fin; Average, the default: their mean), extrapolated after 2039 (Mitigation rows 1052-1663, columns L, AC, AD-AE). The yearly GAINS paths are not used. Until v0.8.4 the prototype ended at FE fin and stayed flat (data bug DB1, which wrongly said legacy reads zero paths); v0.8.5 aligns it with legacy (EFFinShare, EFWEIGHT, NONCO2).</w:t>
       </w:r>
       <w:r>
         <w:t xml:space="preserve"> </w:t>
@@ -2494,7 +2556,7 @@
         <w:t xml:space="preserve"> </w:t>
       </w:r>
       <w:r>
-        <w:t xml:space="preserve">The prototype now does exactly what legacy 465 does (v8.5). Plan: get the GAINS factor paths by year (proprietary) or confirm that the base and final factors are the intended data; check the 2040-2041 extrapolation and the EFSel average with the CPAT team.</w:t>
+        <w:t xml:space="preserve">The prototype now does exactly what legacy 465 does (v0.8.5). Plan: get the GAINS factor paths by year (proprietary) or confirm that the base and final factors are the intended data; check the 2040-2041 extrapolation and the EFSel average with the CPAT team.</w:t>
       </w:r>
       <w:r>
         <w:t xml:space="preserve"> </w:t>
@@ -2708,7 +2770,7 @@
         <w:t xml:space="preserve"> </w:t>
       </w:r>
       <w:r>
-        <w:t xml:space="preserve">The last historical price year is 2022 (Settings C10, v3.7), as legacy 456, whose prices stay near their 2022 USD level; legacy 465 uses 2024 (v9.0 check: the electricity tax and price-chain residual are those of 2022 in the prototype). The IMF dataset also holds 2023-2024, when Egypt prices fell sharply in USD after the devaluation (gasoline 0.60 to 0.34 $/l); with C10 = 2024, fuel use and electricity demand jump in 2023 and the gap to legacy fuel use grows from 17% to 46%. Demand responds to real USD prices, as legacy.</w:t>
+        <w:t xml:space="preserve">The last historical price year is 2022 (Settings C10, v0.3.7), as legacy 456, whose prices stay near their 2022 USD level; legacy 465 uses 2024 (v0.9.0 check: the electricity tax and price-chain residual are those of 2022 in the prototype). The IMF dataset also holds 2023-2024, when Egypt prices fell sharply in USD after the devaluation (gasoline 0.60 to 0.34 $/l); with C10 = 2024, fuel use and electricity demand jump in 2023 and the gap to legacy fuel use grows from 17% to 46%. Demand responds to real USD prices, as legacy.</w:t>
       </w:r>
       <w:r>
         <w:t xml:space="preserve"> </w:t>
@@ -2740,7 +2802,7 @@
         <w:t xml:space="preserve"> </w:t>
       </w:r>
       <w:r>
-        <w:t xml:space="preserve">v9.0 (user 2026-10-29): the last historical price year is 2024, as legacy (price data through 2024, projection from 2025). v3.7-v8.5 held 2022, to stay close to the legacy cached run of an older price vintage (2026-10-09 comparison).</w:t>
+        <w:t xml:space="preserve">v0.9.0 (user 2026-10-29): the last historical price year is 2024, as legacy (price data through 2024, projection from 2025). v0.3.7-v0.8.5 held 2022, to stay close to the legacy cached run of an older price vintage (2026-10-09 comparison).</w:t>
       </w:r>
       <w:r>
         <w:t xml:space="preserve"> </w:t>
@@ -2900,7 +2962,7 @@
           <w:bCs/>
           <w:b/>
         </w:rPr>
-        <w:t xml:space="preserve">I92 (was DI4 &lt; I22). Fuel-use shock of 2023-2024 (replicated v3.11).</w:t>
+        <w:t xml:space="preserve">I92 (was DI4 &lt; I22). Fuel-use shock of 2023-2024 (replicated v0.3.11).</w:t>
       </w:r>
       <w:r>
         <w:t xml:space="preserve"> </w:t>
@@ -2918,7 +2980,7 @@
         <w:t xml:space="preserve">”</w:t>
       </w:r>
       <w:r>
-        <w:t xml:space="preserve">): -20.8% in 2023, +9.2% in 2024, so fuel use is 13.5% lower from 2024 on. Replicated in v3.11 for fuels (header row 11) and power demand, switch Settings C19 on. Open questions kept: the label</w:t>
+        <w:t xml:space="preserve">): -20.8% in 2023, +9.2% in 2024, so fuel use is 13.5% lower from 2024 on. Replicated in v0.3.11 for fuels (header row 11) and power demand, switch Settings C19 on. Open questions kept: the label</w:t>
       </w:r>
       <w:r>
         <w:t xml:space="preserve"> </w:t>
@@ -2983,7 +3045,7 @@
         <w:t xml:space="preserve"> </w:t>
       </w:r>
       <w:r>
-        <w:t xml:space="preserve">Replicated v3.11; source of the values to trace.</w:t>
+        <w:t xml:space="preserve">Replicated v0.3.11; source of the values to trace.</w:t>
       </w:r>
       <w:r>
         <w:t xml:space="preserve"> </w:t>
@@ -3049,7 +3111,7 @@
         <w:t xml:space="preserve"> </w:t>
       </w:r>
       <w:r>
-        <w:t xml:space="preserve">v9.0 (user 2026-10-29: legacy prices): legacy 465 Prices_dom already holds the corrected Egypt block; the prototype data equal it cell by cell except the spot coal and gas cells (I150). LD4 and LD33 are Same.</w:t>
+        <w:t xml:space="preserve">v0.9.0 (user 2026-10-29: legacy prices): legacy 465 Prices_dom already holds the corrected Egypt block; the prototype data equal it cell by cell except the spot coal and gas cells (I150). LD4 and LD33 are Same.</w:t>
       </w:r>
       <w:r>
         <w:t xml:space="preserve"> </w:t>
@@ -3115,7 +3177,7 @@
         <w:t xml:space="preserve"> </w:t>
       </w:r>
       <w:r>
-        <w:t xml:space="preserve">Fixed: a blank VAT cell takes the general VAT rate (VAT_WEO) for residential coal and gas and the oil products, 0 for power, industry and biomass (since v0.14; was departure LD3, data bug DB2)..</w:t>
+        <w:t xml:space="preserve">Fixed: a blank VAT cell takes the general VAT rate (VAT_WEO) for residential coal and gas and the oil products, 0 for power, industry and biomass (since v0.0.14; was departure LD3, data bug DB2)..</w:t>
       </w:r>
       <w:r>
         <w:t xml:space="preserve"> </w:t>
@@ -3181,7 +3243,7 @@
         <w:t xml:space="preserve"> </w:t>
       </w:r>
       <w:r>
-        <w:t xml:space="preserve">Legacy power data give wind, solar and hydro efficiencies of 1.004, 1.026 and 0.937, so their primary energy (generation / efficiency) differs from the physical energy content convention (1); solar shows more output than input. It enters total primary energy supply (Kaya, v3.18) and the power fuel totals; about 0.1% of TPES for Egypt.</w:t>
+        <w:t xml:space="preserve">Legacy power data give wind, solar and hydro efficiencies of 1.004, 1.026 and 0.937, so their primary energy (generation / efficiency) differs from the physical energy content convention (1); solar shows more output than input. It enters total primary energy supply (Kaya, v0.3.18) and the power fuel totals; about 0.1% of TPES for Egypt.</w:t>
       </w:r>
       <w:r>
         <w:t xml:space="preserve"> </w:t>
@@ -3213,7 +3275,7 @@
         <w:t xml:space="preserve"> </w:t>
       </w:r>
       <w:r>
-        <w:t xml:space="preserve">As legacy (v3.18); set the renewable efficiencies to 1 if the data are confirmed.</w:t>
+        <w:t xml:space="preserve">As legacy (v0.3.18); set the renewable efficiencies to 1 if the data are confirmed.</w:t>
       </w:r>
       <w:r>
         <w:t xml:space="preserve"> </w:t>
@@ -3247,7 +3309,7 @@
         <w:t xml:space="preserve"> </w:t>
       </w:r>
       <w:r>
-        <w:t xml:space="preserve">Legacy Mitigation reads the capital cost time factors of wind and solar from the Power tab; its cached values for 2039-2041 (wind 0.920, 0.915, 0.909) disagree with the cached Power cells they reference (0.923, 0.920, 0.918), apparently a stale cache in the distributed file. Since v4.7 the prototype computes the factors from the Power tab by formula, so its power results (new capacity and investment of solar, wind and gas, then power fuel use and emissions) depart from legacy’s stored run from 2039; nothing changes before 2039.</w:t>
+        <w:t xml:space="preserve">Legacy Mitigation reads the capital cost time factors of wind and solar from the Power tab; its cached values for 2039-2041 (wind 0.920, 0.915, 0.909) disagree with the cached Power cells they reference (0.923, 0.920, 0.918), apparently a stale cache in the distributed file. Since v0.4.7 the prototype computes the factors from the Power tab by formula, so its power results (new capacity and investment of solar, wind and gas, then power fuel use and emissions) depart from legacy’s stored run from 2039; nothing changes before 2039.</w:t>
       </w:r>
       <w:r>
         <w:t xml:space="preserve"> </w:t>
@@ -3279,7 +3341,7 @@
         <w:t xml:space="preserve"> </w:t>
       </w:r>
       <w:r>
-        <w:t xml:space="preserve">v4.7: the formula follows the Power tab; recheck against a fresh legacy run.</w:t>
+        <w:t xml:space="preserve">v0.4.7: the formula follows the Power tab; recheck against a fresh legacy run.</w:t>
       </w:r>
       <w:r>
         <w:t xml:space="preserve"> </w:t>
@@ -3345,7 +3407,7 @@
         <w:t xml:space="preserve"> </w:t>
       </w:r>
       <w:r>
-        <w:t xml:space="preserve">v5.7: GDP solved (WEO NGDP_R, 2000-2040). v6.1: reference years 2021-2024 read the GHGs inventory (rows ndc.hc, ndc.hv), 2022 onwards the model. Still open: historical GHGs 2018-2020 (GHGHist ends 2017, CO2 2020): data request.</w:t>
+        <w:t xml:space="preserve">v0.5.7: GDP solved (WEO NGDP_R, 2000-2040). v0.6.1: reference years 2021-2024 read the GHGs inventory (rows ndc.hc, ndc.hv), 2022 onwards the model. Still open: historical GHGs 2018-2020 (GHGHist ends 2017, CO2 2020): data request.</w:t>
       </w:r>
       <w:r>
         <w:t xml:space="preserve"> </w:t>
@@ -3673,13 +3735,13 @@
           <w:bCs/>
           <w:b/>
         </w:rPr>
-        <w:t xml:space="preserve">I5. Totals include power since v1.09.</w:t>
-      </w:r>
-      <w:r>
-        <w:t xml:space="preserve"> </w:t>
-      </w:r>
-      <w:r>
-        <w:t xml:space="preserve">Fuel use and revenue totals of v1.09 and later include power and are not comparable with v1.08 and earlier outputs.</w:t>
+        <w:t xml:space="preserve">I5. Totals include power since v0.1.09.</w:t>
+      </w:r>
+      <w:r>
+        <w:t xml:space="preserve"> </w:t>
+      </w:r>
+      <w:r>
+        <w:t xml:space="preserve">Fuel use and revenue totals of v0.1.09 and later include power and are not comparable with v0.1.08 and earlier outputs.</w:t>
       </w:r>
       <w:r>
         <w:t xml:space="preserve"> </w:t>
@@ -3729,7 +3791,7 @@
         <w:t xml:space="preserve"> </w:t>
       </w:r>
       <w:r>
-        <w:t xml:space="preserve">Subsidies are negative (v2.4): the gap is negative when the tariff is below the modelled supply cost and positive when it is above; fuel subsidies count the negative part of the existing taxes only.</w:t>
+        <w:t xml:space="preserve">Subsidies are negative (v0.2.4): the gap is negative when the tariff is below the modelled supply cost and positive when it is above; fuel subsidies count the negative part of the existing taxes only.</w:t>
       </w:r>
       <w:r>
         <w:t xml:space="preserve"> </w:t>
@@ -3761,7 +3823,7 @@
         <w:t xml:space="preserve"> </w:t>
       </w:r>
       <w:r>
-        <w:t xml:space="preserve">Exception by decision (v2.4): sign convention only, values as legacy.</w:t>
+        <w:t xml:space="preserve">Exception by decision (v0.2.4): sign convention only, values as legacy.</w:t>
       </w:r>
       <w:r>
         <w:t xml:space="preserve"> </w:t>
@@ -4027,7 +4089,7 @@
         <w:t xml:space="preserve"> </w:t>
       </w:r>
       <w:r>
-        <w:t xml:space="preserve">v5.7: I25 closed (v5.6); the remaining distance is the documented data and bug-fix differences (legacy_comparison, LegacyDiff).</w:t>
+        <w:t xml:space="preserve">v0.5.7: I25 closed (v0.5.6); the remaining distance is the documented data and bug-fix differences (legacy_comparison, LegacyDiff).</w:t>
       </w:r>
       <w:r>
         <w:t xml:space="preserve"> </w:t>
@@ -4055,13 +4117,13 @@
           <w:bCs/>
           <w:b/>
         </w:rPr>
-        <w:t xml:space="preserve">I15. Subsidy rows changed sign in v2.4.</w:t>
-      </w:r>
-      <w:r>
-        <w:t xml:space="preserve"> </w:t>
-      </w:r>
-      <w:r>
-        <w:t xml:space="preserve">esub, esubpu, rsub, prsub, sgap and rgap are negative from v2.4 (net existing revenue rnet = rtx + rsub, unchanged in value). Outputs stored with v2.3 or earlier have the opposite sign in these rows.</w:t>
+        <w:t xml:space="preserve">I15. Subsidy rows changed sign in v0.2.4.</w:t>
+      </w:r>
+      <w:r>
+        <w:t xml:space="preserve"> </w:t>
+      </w:r>
+      <w:r>
+        <w:t xml:space="preserve">esub, esubpu, rsub, prsub, sgap and rgap are negative from v0.2.4 (net existing revenue rnet = rtx + rsub, unchanged in value). Outputs stored with v0.2.3 or earlier have the opposite sign in these rows.</w:t>
       </w:r>
       <w:r>
         <w:t xml:space="preserve"> </w:t>
@@ -4155,13 +4217,13 @@
           <w:bCs/>
           <w:b/>
         </w:rPr>
-        <w:t xml:space="preserve">I18. GHG totals use energy CO2 without inventory adjustment (resolved v3.2).</w:t>
-      </w:r>
-      <w:r>
-        <w:t xml:space="preserve"> </w:t>
-      </w:r>
-      <w:r>
-        <w:t xml:space="preserve">Energy CO2 in section 14 was section 13 (IIASA EFs, no adjustment to the inventory) plus flaring: 225 Mt in 2022 against 252 Mt in the inventory. v3.2: every CO2 EF is calibrated to the inventory of GHGYear (Settings EFCalib), so 2024 matches; 2022 stays below the 2022 inventory because of the 2021-2022 inventory break (I91).</w:t>
+        <w:t xml:space="preserve">I18. GHG totals use energy CO2 without inventory adjustment (resolved v0.3.2).</w:t>
+      </w:r>
+      <w:r>
+        <w:t xml:space="preserve"> </w:t>
+      </w:r>
+      <w:r>
+        <w:t xml:space="preserve">Energy CO2 in section 14 was section 13 (IIASA EFs, no adjustment to the inventory) plus flaring: 225 Mt in 2022 against 252 Mt in the inventory. v0.3.2: every CO2 EF is calibrated to the inventory of GHGYear (Settings EFCalib), so 2024 matches; 2022 stays below the 2022 inventory because of the 2021-2022 inventory break (I91).</w:t>
       </w:r>
       <w:r>
         <w:t xml:space="preserve"> </w:t>
@@ -4193,7 +4255,7 @@
         <w:t xml:space="preserve"> </w:t>
       </w:r>
       <w:r>
-        <w:t xml:space="preserve">v3.2 (switch, off by default as legacy since v3.4).</w:t>
+        <w:t xml:space="preserve">v0.3.2 (switch, off by default as legacy since v0.3.4).</w:t>
       </w:r>
       <w:r>
         <w:t xml:space="preserve"> </w:t>
@@ -4221,13 +4283,13 @@
           <w:bCs/>
           <w:b/>
         </w:rPr>
-        <w:t xml:space="preserve">I19. Jet fuel (replicated v3.11).</w:t>
-      </w:r>
-      <w:r>
-        <w:t xml:space="preserve"> </w:t>
-      </w:r>
-      <w:r>
-        <w:t xml:space="preserve">Legacy domestic aviation burns jet fuel (707 ktoe in 2022). Since v3.11 the prototype has the fuel jfu (aviation only, kerosene price build-up, legacy EF row 1011, kerosene carbon-tax coverage switch); the legacy comparison includes it.</w:t>
+        <w:t xml:space="preserve">I19. Jet fuel (replicated v0.3.11).</w:t>
+      </w:r>
+      <w:r>
+        <w:t xml:space="preserve"> </w:t>
+      </w:r>
+      <w:r>
+        <w:t xml:space="preserve">Legacy domestic aviation burns jet fuel (707 ktoe in 2022). Since v0.3.11 the prototype has the fuel jfu (aviation only, kerosene price build-up, legacy EF row 1011, kerosene carbon-tax coverage switch); the legacy comparison includes it.</w:t>
       </w:r>
       <w:r>
         <w:t xml:space="preserve"> </w:t>
@@ -4259,7 +4321,7 @@
         <w:t xml:space="preserve"> </w:t>
       </w:r>
       <w:r>
-        <w:t xml:space="preserve">v3.11.</w:t>
+        <w:t xml:space="preserve">v0.3.11.</w:t>
       </w:r>
       <w:r>
         <w:t xml:space="preserve"> </w:t>
@@ -4287,13 +4349,13 @@
           <w:bCs/>
           <w:b/>
         </w:rPr>
-        <w:t xml:space="preserve">I21. ETS: one auctioned share for every sector (replicated v4.15).</w:t>
-      </w:r>
-      <w:r>
-        <w:t xml:space="preserve"> </w:t>
-      </w:r>
-      <w:r>
-        <w:t xml:space="preserve">Legacy allocates by one auctioned share path (MTInputs rows 90-92, default 0: everything allocated free), the same for every sector. The prototype had benchmarks by sector group typed on Constants (v1.02), so an MTInputs auctioned share had no effect; since v4.15 the benchmarks are 1 - the MTInputs share of the scenario (user 2026-10-18), as legacy. Benchmarks by sector (output-based) come later.</w:t>
+        <w:t xml:space="preserve">I21. ETS: one auctioned share for every sector (replicated v0.4.15).</w:t>
+      </w:r>
+      <w:r>
+        <w:t xml:space="preserve"> </w:t>
+      </w:r>
+      <w:r>
+        <w:t xml:space="preserve">Legacy allocates by one auctioned share path (MTInputs rows 90-92, default 0: everything allocated free), the same for every sector. The prototype had benchmarks by sector group typed on Constants (v0.1.02), so an MTInputs auctioned share had no effect; since v0.4.15 the benchmarks are 1 - the MTInputs share of the scenario (user 2026-10-18), as legacy. Benchmarks by sector (output-based) come later.</w:t>
       </w:r>
       <w:r>
         <w:t xml:space="preserve"> </w:t>
@@ -4325,7 +4387,7 @@
         <w:t xml:space="preserve"> </w:t>
       </w:r>
       <w:r>
-        <w:t xml:space="preserve">v4.15 (user 2026-10-18): benchmarks = 1 - the MTInputs auctioned share (rows 90-91, one share for all sectors, as legacy); benchmarks by sector later.</w:t>
+        <w:t xml:space="preserve">v0.4.15 (user 2026-10-18): benchmarks = 1 - the MTInputs auctioned share (rows 90-91, one share for all sectors, as legacy); benchmarks by sector later.</w:t>
       </w:r>
       <w:r>
         <w:t xml:space="preserve"> </w:t>
@@ -4391,7 +4453,7 @@
         <w:t xml:space="preserve"> </w:t>
       </w:r>
       <w:r>
-        <w:t xml:space="preserve">Traced (v5.6): legacy process emissions = 2023 inventory x the year-on-year growth of industrial energy CO2 (row 6576; 2024: +16.8%, the rebound after the 2023 demand shock, so 56.9 -&gt; 66.5). The prototype floored that growth at 0 (a departure: removed in v5.6, as legacy). The remaining gap is the industrial energy CO2 path, part of the fuel-use gap (I14).</w:t>
+        <w:t xml:space="preserve">Traced (v0.5.6): legacy process emissions = 2023 inventory x the year-on-year growth of industrial energy CO2 (row 6576; 2024: +16.8%, the rebound after the 2023 demand shock, so 56.9 -&gt; 66.5). The prototype floored that growth at 0 (a departure: removed in v0.5.6, as legacy). The remaining gap is the industrial energy CO2 path, part of the fuel-use gap (I14).</w:t>
       </w:r>
       <w:r>
         <w:t xml:space="preserve"> </w:t>
@@ -4425,7 +4487,7 @@
         <w:t xml:space="preserve"> </w:t>
       </w:r>
       <w:r>
-        <w:t xml:space="preserve">Oil, gas and coal production held at the base year (fuel supply methane) and energy N2O moving with energy CO2 were applied as defaults in v2.8; their legacy counterparts are not yet checked.</w:t>
+        <w:t xml:space="preserve">Oil, gas and coal production held at the base year (fuel supply methane) and energy N2O moving with energy CO2 were applied as defaults in v0.2.8; their legacy counterparts are not yet checked.</w:t>
       </w:r>
       <w:r>
         <w:t xml:space="preserve"> </w:t>
@@ -4457,7 +4519,7 @@
         <w:t xml:space="preserve"> </w:t>
       </w:r>
       <w:r>
-        <w:t xml:space="preserve">Checked (v5.6): energy N2O moves with energy CO2 as legacy (row 7549 = previous x CO2 ratio). Production for fuel-supply methane differs: now issue I66.</w:t>
+        <w:t xml:space="preserve">Checked (v0.5.6): energy N2O moves with energy CO2 as legacy (row 7549 = previous x CO2 ratio). Production for fuel-supply methane differs: now issue I66.</w:t>
       </w:r>
       <w:r>
         <w:t xml:space="preserve"> </w:t>
@@ -4551,13 +4613,13 @@
           <w:bCs/>
           <w:b/>
         </w:rPr>
-        <w:t xml:space="preserve">I29. Excel repair prompt (resolved v3.7).</w:t>
-      </w:r>
-      <w:r>
-        <w:t xml:space="preserve"> </w:t>
-      </w:r>
-      <w:r>
-        <w:t xml:space="preserve">Excel 365 removed the cell formulas calling the LAMBDAs SCALE and SHARE (found by bisection with the repair log); renamed SCALEBY and SHAREOF in v3.7. The quick check opens the file in Excel where Excel is installed.</w:t>
+        <w:t xml:space="preserve">I29. Excel repair prompt (resolved v0.3.7).</w:t>
+      </w:r>
+      <w:r>
+        <w:t xml:space="preserve"> </w:t>
+      </w:r>
+      <w:r>
+        <w:t xml:space="preserve">Excel 365 removed the cell formulas calling the LAMBDAs SCALE and SHARE (found by bisection with the repair log); renamed SCALEBY and SHAREOF in v0.3.7. The quick check opens the file in Excel where Excel is installed.</w:t>
       </w:r>
       <w:r>
         <w:t xml:space="preserve"> </w:t>
@@ -4589,7 +4651,7 @@
         <w:t xml:space="preserve"> </w:t>
       </w:r>
       <w:r>
-        <w:t xml:space="preserve">v3.7: LAMBDAs renamed; confirm in Excel (quick check on Windows).</w:t>
+        <w:t xml:space="preserve">v0.3.7: LAMBDAs renamed; confirm in Excel (quick check on Windows).</w:t>
       </w:r>
       <w:r>
         <w:t xml:space="preserve"> </w:t>
@@ -4655,7 +4717,7 @@
         <w:t xml:space="preserve"> </w:t>
       </w:r>
       <w:r>
-        <w:t xml:space="preserve">Tested separately by the user (2026-10-19); no goal-seek runs in builds or checks (NORMS 5). Last full check (v5.3): worst gap 0.0265 after 20 iterations.</w:t>
+        <w:t xml:space="preserve">Tested separately by the user (2026-10-19); no goal-seek runs in builds or checks (NORMS 5). Last full check (v0.5.3): worst gap 0.0265 after 20 iterations.</w:t>
       </w:r>
       <w:r>
         <w:t xml:space="preserve"> </w:t>
@@ -4707,7 +4769,7 @@
         <w:t xml:space="preserve"> </w:t>
       </w:r>
       <w:r>
-        <w:t xml:space="preserve">with no price moving. Survey v4.15: coal and gas are averaged over power generation, residential and the 8 industry subsectors with baseline quantities (a Laspeyres index), electricity with each scenario’s own consumption, oil products are single prices. v4.15 replicates legacy as the default (Settings C54 Legacy</w:t>
+        <w:t xml:space="preserve">with no price moving. Survey v0.4.15: coal and gas are averaged over power generation, residential and the 8 industry subsectors with baseline quantities (a Laspeyres index), electricity with each scenario’s own consumption, oil products are single prices. v0.4.15 replicates legacy as the default (Settings C54 Legacy</w:t>
       </w:r>
       <w:r>
         <w:rPr>
@@ -4740,7 +4802,7 @@
         <w:t xml:space="preserve"> </w:t>
       </w:r>
       <w:r>
-        <w:t xml:space="preserve">v4.15 (user 2026-10-18): legacy averages are the default (pav.leg, pav.lidx, pav.idx; Settings C54 Legacy</w:t>
+        <w:t xml:space="preserve">v0.4.15 (user 2026-10-18): legacy averages are the default (pav.leg, pav.lidx, pav.idx; Settings C54 Legacy</w:t>
       </w:r>
       <w:r>
         <w:rPr>
@@ -4769,7 +4831,7 @@
           <w:bCs/>
           <w:b/>
         </w:rPr>
-        <w:t xml:space="preserve">I32. Energy CO2 calibration to the inventory: as legacy since v4.11.</w:t>
+        <w:t xml:space="preserve">I32. Energy CO2 calibration to the inventory: as legacy since v0.4.11.</w:t>
       </w:r>
       <w:r>
         <w:t xml:space="preserve"> </w:t>
@@ -4787,7 +4849,7 @@
         <w:t xml:space="preserve">”</w:t>
       </w:r>
       <w:r>
-        <w:t xml:space="preserve">, Yes* by default) multiplies every CO2 EF by the inventory energy CO2 of the year before the base year over the estimate from the base-year energy balance (Egypt: 2021 inventory against 2022, 0.930), so CO2 is about 7% below uncalibrated EFs in every sector. The inventory has a break between 2021 and 2022 (I17: 211 to 252 Mt), which legacy carries into the factor. v4.11 replicates legacy (user 2026-10-18: go with legacy); before, the prototype calibrated in 2024 and kept the switch off (user decisions v3.2, v3.4).</w:t>
+        <w:t xml:space="preserve">, Yes* by default) multiplies every CO2 EF by the inventory energy CO2 of the year before the base year over the estimate from the base-year energy balance (Egypt: 2021 inventory against 2022, 0.930), so CO2 is about 7% below uncalibrated EFs in every sector. The inventory has a break between 2021 and 2022 (I17: 211 to 252 Mt), which legacy carries into the factor. v0.4.11 replicates legacy (user 2026-10-18: go with legacy); before, the prototype calibrated in 2024 and kept the switch off (user decisions v0.3.2, v0.3.4).</w:t>
       </w:r>
       <w:r>
         <w:t xml:space="preserve"> </w:t>
@@ -4819,7 +4881,7 @@
         <w:t xml:space="preserve"> </w:t>
       </w:r>
       <w:r>
-        <w:t xml:space="preserve">Replicated in v4.11 (user 2026-10-18: go with legacy); the inventory break (I91) stays in the factor, as legacy.</w:t>
+        <w:t xml:space="preserve">Replicated in v0.4.11 (user 2026-10-18: go with legacy); the inventory break (I91) stays in the factor, as legacy.</w:t>
       </w:r>
       <w:r>
         <w:t xml:space="preserve"> </w:t>
@@ -4853,7 +4915,7 @@
         <w:t xml:space="preserve"> </w:t>
       </w:r>
       <w:r>
-        <w:t xml:space="preserve">extract_data rewrites every data file from its sources; prices_dom.csv then loses the corrected Egypt block (update_prices_egypt must run after it), and the files come out with CRLF line ends. v3.11 kept only the jet-fuel rows of its run.</w:t>
+        <w:t xml:space="preserve">extract_data rewrites every data file from its sources; prices_dom.csv then loses the corrected Egypt block (update_prices_egypt must run after it), and the files come out with CRLF line ends. v0.3.11 kept only the jet-fuel rows of its run.</w:t>
       </w:r>
       <w:r>
         <w:t xml:space="preserve"> </w:t>
@@ -4885,7 +4947,7 @@
         <w:t xml:space="preserve"> </w:t>
       </w:r>
       <w:r>
-        <w:t xml:space="preserve">v5.7: extract_data writes LF line ends and runs update_prices_egypt after the price extraction, so the corrected Egypt block is kept.</w:t>
+        <w:t xml:space="preserve">v0.5.7: extract_data writes LF line ends and runs update_prices_egypt after the price extraction, so the corrected Egypt block is kept.</w:t>
       </w:r>
       <w:r>
         <w:t xml:space="preserve"> </w:t>
@@ -4952,7 +5014,7 @@
         <w:t xml:space="preserve"> </w:t>
       </w:r>
       <w:r>
-        <w:t xml:space="preserve">(waste is not food or forestry), no combustion CH4 (no factors in legacy). v3.12 replicates the allocation and adds the combustion CH4 of each sector (GAINS factors, section 14), with all fossil fuel supply methane (extraction, downstream gas, coal mining, biomass) under</w:t>
+        <w:t xml:space="preserve">(waste is not food or forestry), no combustion CH4 (no factors in legacy). v0.3.12 replicates the allocation and adds the combustion CH4 of each sector (GAINS factors, section 14), with all fossil fuel supply methane (extraction, downstream gas, coal mining, biomass) under</w:t>
       </w:r>
       <w:r>
         <w:t xml:space="preserve"> </w:t>
@@ -5033,7 +5095,7 @@
         <w:t xml:space="preserve"> </w:t>
       </w:r>
       <w:r>
-        <w:t xml:space="preserve">Legacy’s effective carbon rate (row 16647) and total carbon price (F5d) divide revenue net of subsidies, VAT included, by CO2; the OECD effective carbon rate counts carbon taxes, fuel excises and permit prices only. The prototype replicates the legacy definition (section 17, v3.15) and says so in the note; Egypt has negative rates (subsidies exceed taxes).</w:t>
+        <w:t xml:space="preserve">Legacy’s effective carbon rate (row 16647) and total carbon price (F5d) divide revenue net of subsidies, VAT included, by CO2; the OECD effective carbon rate counts carbon taxes, fuel excises and permit prices only. The prototype replicates the legacy definition (section 17, v0.3.15) and says so in the note; Egypt has negative rates (subsidies exceed taxes).</w:t>
       </w:r>
       <w:r>
         <w:t xml:space="preserve"> </w:t>
@@ -5065,7 +5127,7 @@
         <w:t xml:space="preserve"> </w:t>
       </w:r>
       <w:r>
-        <w:t xml:space="preserve">As legacy (v3.15); an OECD-style rate (carbon taxes, excises, permits) could be added as a memo.</w:t>
+        <w:t xml:space="preserve">As legacy (v0.3.15); an OECD-style rate (carbon taxes, excises, permits) could be added as a memo.</w:t>
       </w:r>
       <w:r>
         <w:t xml:space="preserve"> </w:t>
@@ -5093,13 +5155,13 @@
           <w:bCs/>
           <w:b/>
         </w:rPr>
-        <w:t xml:space="preserve">I39. VAT on oil products charged on the household share only (replicated v4.12).</w:t>
-      </w:r>
-      <w:r>
-        <w:t xml:space="preserve"> </w:t>
-      </w:r>
-      <w:r>
-        <w:t xml:space="preserve">Legacy multiplies the VAT rate of gasoline, diesel, LPG and kerosene by the household share of the product (sheet OilProductShares; Egypt: gasoline 1, diesel 0.03, LPG 0.99, kerosene 0.39), on the view that firms reclaim VAT. The share is one value for all sectors, so household diesel is under-taxed and firms’ gasoline over-taxed; road diesel of households is small, so the effect is mainly on gasoline. Replicated in v4.12 (LD5; user 2026-10-18: an issue, not a bug).</w:t>
+        <w:t xml:space="preserve">I39. VAT on oil products charged on the household share only (replicated v0.4.12).</w:t>
+      </w:r>
+      <w:r>
+        <w:t xml:space="preserve"> </w:t>
+      </w:r>
+      <w:r>
+        <w:t xml:space="preserve">Legacy multiplies the VAT rate of gasoline, diesel, LPG and kerosene by the household share of the product (sheet OilProductShares; Egypt: gasoline 1, diesel 0.03, LPG 0.99, kerosene 0.39), on the view that firms reclaim VAT. The share is one value for all sectors, so household diesel is under-taxed and firms’ gasoline over-taxed; road diesel of households is small, so the effect is mainly on gasoline. Replicated in v0.4.12 (LD5; user 2026-10-18: an issue, not a bug).</w:t>
       </w:r>
       <w:r>
         <w:t xml:space="preserve"> </w:t>
@@ -5131,7 +5193,7 @@
         <w:t xml:space="preserve"> </w:t>
       </w:r>
       <w:r>
-        <w:t xml:space="preserve">Replicated v4.12 (user 2026-10-18); a share by sector would need data by sector.</w:t>
+        <w:t xml:space="preserve">Replicated v0.4.12 (user 2026-10-18); a share by sector would need data by sector.</w:t>
       </w:r>
       <w:r>
         <w:t xml:space="preserve"> </w:t>
@@ -5159,13 +5221,13 @@
           <w:bCs/>
           <w:b/>
         </w:rPr>
-        <w:t xml:space="preserve">I40. Road biofuels: feebate CO2 per liter scaled by the fossil share (replicated v4.12).</w:t>
-      </w:r>
-      <w:r>
-        <w:t xml:space="preserve"> </w:t>
-      </w:r>
-      <w:r>
-        <w:t xml:space="preserve">Legacy scales the CO2 per liter of gasoline and diesel in the vehicle feebate by the fossil share of road gasoline + bioethanol and diesel + biodiesel (E2146:E2147), as if the model’s liters were blends; but road gasoline and diesel exclude the biofuels, which follow them as separate rows (5436-5438). Where biofuels are blended the feebate per liter is lower than the CO2 of the fossil liter. Replicated in v4.12 (LD62; user 2026-10-18). None for Egypt.</w:t>
+        <w:t xml:space="preserve">I40. Road biofuels: feebate CO2 per liter scaled by the fossil share (replicated v0.4.12).</w:t>
+      </w:r>
+      <w:r>
+        <w:t xml:space="preserve"> </w:t>
+      </w:r>
+      <w:r>
+        <w:t xml:space="preserve">Legacy scales the CO2 per liter of gasoline and diesel in the vehicle feebate by the fossil share of road gasoline + bioethanol and diesel + biodiesel (E2146:E2147), as if the model’s liters were blends; but road gasoline and diesel exclude the biofuels, which follow them as separate rows (5436-5438). Where biofuels are blended the feebate per liter is lower than the CO2 of the fossil liter. Replicated in v0.4.12 (LD62; user 2026-10-18). None for Egypt.</w:t>
       </w:r>
       <w:r>
         <w:t xml:space="preserve"> </w:t>
@@ -5197,7 +5259,7 @@
         <w:t xml:space="preserve"> </w:t>
       </w:r>
       <w:r>
-        <w:t xml:space="preserve">Replicated v4.12 (user 2026-10-18); revisit if road fuels are modelled as blends.</w:t>
+        <w:t xml:space="preserve">Replicated v0.4.12 (user 2026-10-18); revisit if road fuels are modelled as blends.</w:t>
       </w:r>
       <w:r>
         <w:t xml:space="preserve"> </w:t>
@@ -5225,13 +5287,13 @@
           <w:bCs/>
           <w:b/>
         </w:rPr>
-        <w:t xml:space="preserve">I41. GDP effects: the impulse is the change in revenue over this year’s GDP (replicated v4.15).</w:t>
-      </w:r>
-      <w:r>
-        <w:t xml:space="preserve"> </w:t>
-      </w:r>
-      <w:r>
-        <w:t xml:space="preserve">Legacy row 14341 takes the yearly change of the revenue gain in USD over the current GDP, not the change of the gain as a share of GDP: with GDP growing, a constant share of GDP keeps giving impulses (Egypt: impulses sum to 4.9% of GDP against a final fiscal space of 3.5%). Replicated in v4.15 (user 2026-10-18: replicate legacy, note issues).</w:t>
+        <w:t xml:space="preserve">I41. GDP effects: the impulse is the change in revenue over this year’s GDP (replicated v0.4.15).</w:t>
+      </w:r>
+      <w:r>
+        <w:t xml:space="preserve"> </w:t>
+      </w:r>
+      <w:r>
+        <w:t xml:space="preserve">Legacy row 14341 takes the yearly change of the revenue gain in USD over the current GDP, not the change of the gain as a share of GDP: with GDP growing, a constant share of GDP keeps giving impulses (Egypt: impulses sum to 4.9% of GDP against a final fiscal space of 3.5%). Replicated in v0.4.15 (user 2026-10-18: replicate legacy, note issues).</w:t>
       </w:r>
       <w:r>
         <w:t xml:space="preserve"> </w:t>
@@ -5263,7 +5325,7 @@
         <w:t xml:space="preserve"> </w:t>
       </w:r>
       <w:r>
-        <w:t xml:space="preserve">Replicated v4.15 (user 2026-10-18); the prototype form (change of the GDP share) is one line.</w:t>
+        <w:t xml:space="preserve">Replicated v0.4.15 (user 2026-10-18); the prototype form (change of the GDP share) is one line.</w:t>
       </w:r>
       <w:r>
         <w:t xml:space="preserve"> </w:t>
@@ -5291,13 +5353,13 @@
           <w:bCs/>
           <w:b/>
         </w:rPr>
-        <w:t xml:space="preserve">I42. GDP effects: impulses only from GDPStartYear (replicated v4.15).</w:t>
-      </w:r>
-      <w:r>
-        <w:t xml:space="preserve"> </w:t>
-      </w:r>
-      <w:r>
-        <w:t xml:space="preserve">Legacy cohorts start in GDPStartYear (MTInputs row 236, Egypt 2025): revenue gained before it never acts on GDP, and the first cohort holds only the change of that year. Replicated in v4.15 (impulse 0 before GDPStartYear).</w:t>
+        <w:t xml:space="preserve">I42. GDP effects: impulses only from GDPStartYear (replicated v0.4.15).</w:t>
+      </w:r>
+      <w:r>
+        <w:t xml:space="preserve"> </w:t>
+      </w:r>
+      <w:r>
+        <w:t xml:space="preserve">Legacy cohorts start in GDPStartYear (MTInputs row 236, Egypt 2025): revenue gained before it never acts on GDP, and the first cohort holds only the change of that year. Replicated in v0.4.15 (impulse 0 before GDPStartYear).</w:t>
       </w:r>
       <w:r>
         <w:t xml:space="preserve"> </w:t>
@@ -5329,7 +5391,7 @@
         <w:t xml:space="preserve"> </w:t>
       </w:r>
       <w:r>
-        <w:t xml:space="preserve">Replicated v4.15.</w:t>
+        <w:t xml:space="preserve">Replicated v0.4.15.</w:t>
       </w:r>
       <w:r>
         <w:t xml:space="preserve"> </w:t>
@@ -5395,7 +5457,7 @@
         <w:t xml:space="preserve"> </w:t>
       </w:r>
       <w:r>
-        <w:t xml:space="preserve">Replicated v5.7: rows fis.impp and fis.lagp (impulse 0 before CPIntro) feed every revenue use but the excise drag, as legacy rows 96-100.</w:t>
+        <w:t xml:space="preserve">Replicated v0.5.7: rows fis.impp and fis.lagp (impulse 0 before CPIntro) feed every revenue use but the excise drag, as legacy rows 96-100.</w:t>
       </w:r>
       <w:r>
         <w:t xml:space="preserve"> </w:t>
@@ -5423,13 +5485,13 @@
           <w:bCs/>
           <w:b/>
         </w:rPr>
-        <w:t xml:space="preserve">I44. Multipliers: the income-group spread added to manual and country multipliers (replicated v4.15).</w:t>
-      </w:r>
-      <w:r>
-        <w:t xml:space="preserve"> </w:t>
-      </w:r>
-      <w:r>
-        <w:t xml:space="preserve">Legacy Low / High (FmAdj) adds -/+ the standard deviation of the income group to every source, also to manual and country-estimated multipliers. Replicated in v4.15 (Inputs_mult est and man columns).</w:t>
+        <w:t xml:space="preserve">I44. Multipliers: the income-group spread added to manual and country multipliers (replicated v0.4.15).</w:t>
+      </w:r>
+      <w:r>
+        <w:t xml:space="preserve"> </w:t>
+      </w:r>
+      <w:r>
+        <w:t xml:space="preserve">Legacy Low / High (FmAdj) adds -/+ the standard deviation of the income group to every source, also to manual and country-estimated multipliers. Replicated in v0.4.15 (Inputs_mult est and man columns).</w:t>
       </w:r>
       <w:r>
         <w:t xml:space="preserve"> </w:t>
@@ -5461,7 +5523,7 @@
         <w:t xml:space="preserve"> </w:t>
       </w:r>
       <w:r>
-        <w:t xml:space="preserve">Replicated v4.15.</w:t>
+        <w:t xml:space="preserve">Replicated v0.4.15.</w:t>
       </w:r>
       <w:r>
         <w:t xml:space="preserve"> </w:t>
@@ -5531,7 +5593,7 @@
           <w:bCs/>
           <w:b/>
         </w:rPr>
-        <w:t xml:space="preserve">table (replicated v4.15).</w:t>
+        <w:t xml:space="preserve">table (replicated v0.4.15).</w:t>
       </w:r>
       <w:r>
         <w:t xml:space="preserve"> </w:t>
@@ -5573,7 +5635,7 @@
         <w:t xml:space="preserve"> </w:t>
       </w:r>
       <w:r>
-        <w:t xml:space="preserve">table (rows 210-408) is never used. Replicated in v4.15.</w:t>
+        <w:t xml:space="preserve">table (rows 210-408) is never used. Replicated in v0.4.15.</w:t>
       </w:r>
       <w:r>
         <w:t xml:space="preserve"> </w:t>
@@ -5605,7 +5667,7 @@
         <w:t xml:space="preserve"> </w:t>
       </w:r>
       <w:r>
-        <w:t xml:space="preserve">Replicated v4.15.</w:t>
+        <w:t xml:space="preserve">Replicated v0.4.15.</w:t>
       </w:r>
       <w:r>
         <w:t xml:space="preserve"> </w:t>
@@ -5671,7 +5733,7 @@
         <w:t xml:space="preserve"> </w:t>
       </w:r>
       <w:r>
-        <w:t xml:space="preserve">Renewable subsidies: in the power model since v5.4 (prrns), counted in rsub, rtot and block 12e row rpol.ren, as legacy rows 7882-7890. Transport revenues: dropped with the engineer road model (I61, user 2026-10-20); row rpol.trs stays 0.</w:t>
+        <w:t xml:space="preserve">Renewable subsidies: in the power model since v0.5.4 (prrns), counted in rsub, rtot and block 12e row rpol.ren, as legacy rows 7882-7890. Transport revenues: dropped with the engineer road model (I61, user 2026-10-20); row rpol.trs stays 0.</w:t>
       </w:r>
       <w:r>
         <w:t xml:space="preserve"> </w:t>
@@ -5705,7 +5767,7 @@
         <w:t xml:space="preserve"> </w:t>
       </w:r>
       <w:r>
-        <w:t xml:space="preserve">Legacy counts the methane fee in total revenue (row 8010) and so in the fiscal space, on the scenario’s own activity; the prototype does the same since v9.0 (user 2026-10-29). Before (v6.2-v8.5), the prototype counted it with the stored scenario-1 activity of downstream gas and biomass use (v6.2, user decision 2026-10-20: no vulnerability to circular references through the GDP feedback). Differs from legacy only when a policy changes gas or biomass use and a methane fee applies. None for Egypt (no methane fee in the scenarios).</w:t>
+        <w:t xml:space="preserve">Legacy counts the methane fee in total revenue (row 8010) and so in the fiscal space, on the scenario’s own activity; the prototype does the same since v0.9.0 (user 2026-10-29). Before (v0.6.2-v0.8.5), the prototype counted it with the stored scenario-1 activity of downstream gas and biomass use (v0.6.2, user decision 2026-10-20: no vulnerability to circular references through the GDP feedback). Differs from legacy only when a policy changes gas or biomass use and a methane fee applies. None for Egypt (no methane fee in the scenarios).</w:t>
       </w:r>
       <w:r>
         <w:t xml:space="preserve"> </w:t>
@@ -5737,7 +5799,7 @@
         <w:t xml:space="preserve"> </w:t>
       </w:r>
       <w:r>
-        <w:t xml:space="preserve">Replicated since v9.0 (user 2026-10-29): the fiscal space counts the methane fee on the scenario’s own activity, as legacy rows 8018-8025 (fis.rev + ch4.rev). Every reference is to the same year and the GDP feedback lags one year, so there is no circular reference (checked by a full recalculation). v6.2-v8.5 used the stored scenario-1 gas and biomass activity (ch4.revf, now a memo row).</w:t>
+        <w:t xml:space="preserve">Replicated since v0.9.0 (user 2026-10-29): the fiscal space counts the methane fee on the scenario’s own activity, as legacy rows 8018-8025 (fis.rev + ch4.rev). Every reference is to the same year and the GDP feedback lags one year, so there is no circular reference (checked by a full recalculation). v0.6.2-v0.8.5 used the stored scenario-1 gas and biomass activity (ch4.revf, now a memo row).</w:t>
       </w:r>
       <w:r>
         <w:t xml:space="preserve"> </w:t>
@@ -5765,13 +5827,13 @@
           <w:bCs/>
           <w:b/>
         </w:rPr>
-        <w:t xml:space="preserve">I48. Price-control phase-out uses the consumer subsidy share (replicated v4.16).</w:t>
-      </w:r>
-      <w:r>
-        <w:t xml:space="preserve"> </w:t>
-      </w:r>
-      <w:r>
-        <w:t xml:space="preserve">Legacy rows 2216-2217 take the floor and slope of the price-control factor from the consumer subsidy share (I2201): there is no price-control share, and a baseline price-control phase-out (share 0) has no effect. The phase-out also scales a floating tax, not only a floating subsidy. Replicated in v4.16 (po.sh.pc).</w:t>
+        <w:t xml:space="preserve">I48. Price-control phase-out uses the consumer subsidy share (replicated v0.4.16).</w:t>
+      </w:r>
+      <w:r>
+        <w:t xml:space="preserve"> </w:t>
+      </w:r>
+      <w:r>
+        <w:t xml:space="preserve">Legacy rows 2216-2217 take the floor and slope of the price-control factor from the consumer subsidy share (I2201): there is no price-control share, and a baseline price-control phase-out (share 0) has no effect. The phase-out also scales a floating tax, not only a floating subsidy. Replicated in v0.4.16 (po.sh.pc).</w:t>
       </w:r>
       <w:r>
         <w:t xml:space="preserve"> </w:t>
@@ -5803,7 +5865,7 @@
         <w:t xml:space="preserve"> </w:t>
       </w:r>
       <w:r>
-        <w:t xml:space="preserve">Replicated v4.16; a price-control share would need an MTInputs row.</w:t>
+        <w:t xml:space="preserve">Replicated v0.4.16; a price-control share would need an MTInputs row.</w:t>
       </w:r>
       <w:r>
         <w:t xml:space="preserve"> </w:t>
@@ -5831,13 +5893,13 @@
           <w:bCs/>
           <w:b/>
         </w:rPr>
-        <w:t xml:space="preserve">I49. Producer subsidies spread over world or domestic demand, in the supply cost (replicated v9.0).</w:t>
-      </w:r>
-      <w:r>
-        <w:t xml:space="preserve"> </w:t>
-      </w:r>
-      <w:r>
-        <w:t xml:space="preserve">Legacy spreads a producer subsidy over world demand (oil) or half world, half domestic demand (coal, gas), and over domestic use (biomass): the per-unit subsidy is then near zero for oil, coal and gas, and enters the supply cost (the pass-through share reaches retail; the price controls absorb the rest). The prototype does the same since v9.0 (R7: psu x psf, block row psp in the supply cost; fiscal line rpsu); electricity producer subsidies enter the power price before policies (pseu, R7.5-R7.9). None for Egypt (data 0).</w:t>
+        <w:t xml:space="preserve">I49. Producer subsidies spread over world or domestic demand, in the supply cost (replicated v0.9.0).</w:t>
+      </w:r>
+      <w:r>
+        <w:t xml:space="preserve"> </w:t>
+      </w:r>
+      <w:r>
+        <w:t xml:space="preserve">Legacy spreads a producer subsidy over world demand (oil) or half world, half domestic demand (coal, gas), and over domestic use (biomass): the per-unit subsidy is then near zero for oil, coal and gas, and enters the supply cost (the pass-through share reaches retail; the price controls absorb the rest). The prototype does the same since v0.9.0 (R7: psu x psf, block row psp in the supply cost; fiscal line rpsu); electricity producer subsidies enter the power price before policies (pseu, R7.5-R7.9). None for Egypt (data 0).</w:t>
       </w:r>
       <w:r>
         <w:t xml:space="preserve"> </w:t>
@@ -5869,7 +5931,7 @@
         <w:t xml:space="preserve"> </w:t>
       </w:r>
       <w:r>
-        <w:t xml:space="preserve">Replicated as legacy (v9.0, R7): the phase-out in the supply cost (psu x psf, block row psp), the price controls absorb (1 - pass-through); the v6.2 wedge rows (psw, ppsw, psr) removed. Electricity producer subsidies built (R7.5-R7.9; I146). Egypt: no data (0).</w:t>
+        <w:t xml:space="preserve">Replicated as legacy (v0.9.0, R7): the phase-out in the supply cost (psu x psf, block row psp), the price controls absorb (1 - pass-through); the v0.6.2 wedge rows (psw, ppsw, psr) removed. Electricity producer subsidies built (R7.5-R7.9; I146). Egypt: no data (0).</w:t>
       </w:r>
       <w:r>
         <w:t xml:space="preserve"> </w:t>
@@ -5897,7 +5959,7 @@
           <w:bCs/>
           <w:b/>
         </w:rPr>
-        <w:t xml:space="preserve">I50. Residential LPG and kerosene always exempted: all new policy removed (replicated v5.1).</w:t>
+        <w:t xml:space="preserve">I50. Residential LPG and kerosene always exempted: all new policy removed (replicated v0.5.1).</w:t>
       </w:r>
       <w:r>
         <w:t xml:space="preserve"> </w:t>
@@ -5963,7 +6025,7 @@
           <w:bCs/>
           <w:b/>
         </w:rPr>
-        <w:t xml:space="preserve">I51. Residential leakage: the fossil change is efficiency-weighted (replicated v5.1).</w:t>
+        <w:t xml:space="preserve">I51. Residential leakage: the fossil change is efficiency-weighted (replicated v0.5.1).</w:t>
       </w:r>
       <w:r>
         <w:t xml:space="preserve"> </w:t>
@@ -6119,7 +6181,7 @@
         <w:t xml:space="preserve"> </w:t>
       </w:r>
       <w:r>
-        <w:t xml:space="preserve">only if its 2021 value is filled (Mitigation F765:F829 test K$764); years without a value fall back to the data year by year. Could be a bug (intent unclear). Replicated since v9.0 (R8.1-R8.2, Inputs_prices MPU; I139).</w:t>
+        <w:t xml:space="preserve">only if its 2021 value is filled (Mitigation F765:F829 test K$764); years without a value fall back to the data year by year. Could be a bug (intent unclear). Replicated since v0.9.0 (R8.1-R8.2, Inputs_prices MPU; I139).</w:t>
       </w:r>
       <w:r>
         <w:t xml:space="preserve"> </w:t>
@@ -6151,7 +6213,7 @@
         <w:t xml:space="preserve"> </w:t>
       </w:r>
       <w:r>
-        <w:t xml:space="preserve">Replicated (v9.0, R8.1-R8.2; I139): a manual row switches on with a 2021 value; manual years 2021-2026. Ask the CPAT team about the intent.</w:t>
+        <w:t xml:space="preserve">Replicated (v0.9.0, R8.1-R8.2; I139): a manual row switches on with a 2021 value; manual years 2021-2026. Ask the CPAT team about the intent.</w:t>
       </w:r>
       <w:r>
         <w:t xml:space="preserve"> </w:t>
@@ -6634,7 +6696,7 @@
         <w:t xml:space="preserve"> </w:t>
       </w:r>
       <w:r>
-        <w:t xml:space="preserve">Replicated in v5.6: the electricity fuel price reform path enters the excise of policy scenarios (row entx).</w:t>
+        <w:t xml:space="preserve">Replicated in v0.5.6: the electricity fuel price reform path enters the excise of policy scenarios (row entx).</w:t>
       </w:r>
       <w:r>
         <w:t xml:space="preserve"> </w:t>
@@ -6668,7 +6730,7 @@
         <w:t xml:space="preserve"> </w:t>
       </w:r>
       <w:r>
-        <w:t xml:space="preserve">Legacy floors the end-user electricity price at MinPostSubsidyPowerPrice (rows 3617, 3646); the prototype has no floor (MinPostSubsidyPowerPrice is read per scenario since v5.4 but used only where legacy uses it in the cost side).</w:t>
+        <w:t xml:space="preserve">Legacy floors the end-user electricity price at MinPostSubsidyPowerPrice (rows 3617, 3646); the prototype has no floor (MinPostSubsidyPowerPrice is read per scenario since v0.5.4 but used only where legacy uses it in the cost side).</w:t>
       </w:r>
       <w:r>
         <w:t xml:space="preserve"> </w:t>
@@ -6700,7 +6762,7 @@
         <w:t xml:space="preserve"> </w:t>
       </w:r>
       <w:r>
-        <w:t xml:space="preserve">Replicated in v5.6: end-user electricity prices floored at MinPostSubsidyPowerPrice (row rp).</w:t>
+        <w:t xml:space="preserve">Replicated in v0.5.6: end-user electricity prices floored at MinPostSubsidyPowerPrice (row rp).</w:t>
       </w:r>
       <w:r>
         <w:t xml:space="preserve"> </w:t>
@@ -6734,7 +6796,7 @@
         <w:t xml:space="preserve"> </w:t>
       </w:r>
       <w:r>
-        <w:t xml:space="preserve">The engineer road model (v3.5) replicates legacy with its bugs fixed (L25-L41), but its follow-ups are parked (user 2026-10-18: too many issues, not to be fixed now): review of the engineer run in Excel (TrModel), a goal seek to re-solve range anxiety for the corrected model (LD63; Egypt 2025 passenger EV sales share 0.09% vs 0.15% actual), the elasticity branch of road biofuels (LD62) and vehicle revenues in 12b. The default run uses the elasticity road model, as legacy.</w:t>
+        <w:t xml:space="preserve">The engineer road model (v0.3.5) replicates legacy with its bugs fixed (L25-L41), but its follow-ups are parked (user 2026-10-18: too many issues, not to be fixed now): review of the engineer run in Excel (TrModel), a goal seek to re-solve range anxiety for the corrected model (LD63; Egypt 2025 passenger EV sales share 0.09% vs 0.15% actual), the elasticity branch of road biofuels (LD62) and vehicle revenues in 12b. The default run uses the elasticity road model, as legacy.</w:t>
       </w:r>
       <w:r>
         <w:t xml:space="preserve"> </w:t>
@@ -6766,7 +6828,7 @@
         <w:t xml:space="preserve"> </w:t>
       </w:r>
       <w:r>
-        <w:t xml:space="preserve">v9.0: the range-anxiety goal seek (ra_goalseek.py, LegacyDiff 63) and the elasticity branch of road biofuels (R10, LegacyDiff 62) are built; the review of the engineer run in Excel and the vehicle revenues in 12b stay parked.</w:t>
+        <w:t xml:space="preserve">v0.9.0: the range-anxiety goal seek (ra_goalseek.py, LegacyDiff 63) and the elasticity branch of road biofuels (R10, LegacyDiff 62) are built; the review of the engineer run in Excel and the vehicle revenues in 12b stay parked.</w:t>
       </w:r>
       <w:r>
         <w:t xml:space="preserve"> </w:t>
@@ -6964,7 +7026,7 @@
         <w:t xml:space="preserve"> </w:t>
       </w:r>
       <w:r>
-        <w:t xml:space="preserve">Replicated in v5.6: rows ch4.wd, ch4.fk, ch4.pi, ch4.prd (inventory-year activity = base production, to avoid a loop; legacy holds 2022-2023 at the base anyway). Note: legacy CHOOSE reads the Net Zero row for the third and fourth demand scenarios.</w:t>
+        <w:t xml:space="preserve">Replicated in v0.5.6: rows ch4.wd, ch4.fk, ch4.pi, ch4.prd (inventory-year activity = base production, to avoid a loop; legacy holds 2022-2023 at the base anyway). Note: legacy CHOOSE reads the Net Zero row for the third and fourth demand scenarios.</w:t>
       </w:r>
       <w:r>
         <w:t xml:space="preserve"> </w:t>
@@ -7262,7 +7324,7 @@
         <w:t xml:space="preserve"> </w:t>
       </w:r>
       <w:r>
-        <w:t xml:space="preserve">Lookups of the scenario-1 value of the same year (INDEX over a row, MATCH on the year) must not range over later columns: in a recalculation that evaluates the range, a lookup over the whole row reads its own scenario’s later years and closes a circular reference (the prototype had one such row, ener.ref, fixed in v6.2; all others end at the current column). Recommendation to the CPAT team: check the legacy lookups the same way.</w:t>
+        <w:t xml:space="preserve">Lookups of the scenario-1 value of the same year (INDEX over a row, MATCH on the year) must not range over later columns: in a recalculation that evaluates the range, a lookup over the whole row reads its own scenario’s later years and closes a circular reference (the prototype had one such row, ener.ref, fixed in v0.6.2; all others end at the current column). Recommendation to the CPAT team: check the legacy lookups the same way.</w:t>
       </w:r>
       <w:r>
         <w:t xml:space="preserve"> </w:t>
@@ -7294,7 +7356,7 @@
         <w:t xml:space="preserve"> </w:t>
       </w:r>
       <w:r>
-        <w:t xml:space="preserve">Legacy checked (v6.2 scan of every Mitigation formula for reads of later years): no scenario-1 lookup over whole rows (the policy block reads the baseline block in the same column); the cost breakdown (rows 3509-3517) reads the user’s CostBreakdownYear, a report only; the net revenue report rows read the next year: legacy bug L128. prototype: every lookup ends at the current column (ener.ref fixed in v6.2); the quick check tests reads of later years.</w:t>
+        <w:t xml:space="preserve">Legacy checked (v0.6.2 scan of every Mitigation formula for reads of later years): no scenario-1 lookup over whole rows (the policy block reads the baseline block in the same column); the cost breakdown (rows 3509-3517) reads the user’s CostBreakdownYear, a report only; the net revenue report rows read the next year: legacy bug L128. prototype: every lookup ends at the current column (ener.ref fixed in v0.6.2); the quick check tests reads of later years.</w:t>
       </w:r>
       <w:r>
         <w:t xml:space="preserve"> </w:t>
@@ -7328,7 +7390,7 @@
         <w:t xml:space="preserve"> </w:t>
       </w:r>
       <w:r>
-        <w:t xml:space="preserve">Source allocations and intensities of the methane fee must be calibrated on data or base-year activity, never on a later model year: legacy read GHGYear (2024) activity in the earlier years, a read of later years that becomes circular as soon as the fee revenue feeds the GDP effects. The prototype uses data activity since v6.0 and, for the fiscal space, the stored scenario-1 gas and biomass activity (I47). Recommendation to the CPAT team.</w:t>
+        <w:t xml:space="preserve">Source allocations and intensities of the methane fee must be calibrated on data or base-year activity, never on a later model year: legacy read GHGYear (2024) activity in the earlier years, a read of later years that becomes circular as soon as the fee revenue feeds the GDP effects. The prototype uses data activity since v0.6.0 and, for the fiscal space, the stored scenario-1 gas and biomass activity (I47). Recommendation to the CPAT team.</w:t>
       </w:r>
       <w:r>
         <w:t xml:space="preserve"> </w:t>
@@ -7394,7 +7456,7 @@
         <w:t xml:space="preserve"> </w:t>
       </w:r>
       <w:r>
-        <w:t xml:space="preserve">Legacy codes do not follow one protocol: variable names differ by module (trevst vs stockcalc), slots differ in order (fuel.sector and sector.fuel), totals are written all or tot, model letters (.e, .a, .t) end some codes. The prototype follows the protocol from v7.2 (codes R0-R9: legacy variable names, sector before fuel, tot for totals, no model letters); legacy codes that differ are aliases in the crosswalk.</w:t>
+        <w:t xml:space="preserve">Legacy codes do not follow one protocol: variable names differ by module (trevst vs stockcalc), slots differ in order (fuel.sector and sector.fuel), totals are written all or tot, model letters (.e, .a, .t) end some codes. The prototype follows the protocol from v0.7.2 (codes R0-R9: legacy variable names, sector before fuel, tot for totals, no model letters); legacy codes that differ are aliases in the crosswalk.</w:t>
       </w:r>
       <w:r>
         <w:t xml:space="preserve"> </w:t>
@@ -7426,7 +7488,7 @@
         <w:t xml:space="preserve"> </w:t>
       </w:r>
       <w:r>
-        <w:t xml:space="preserve">v7.2 (codes R0-R9): the prototype codes follow the protocol; legacy codes that differ are aliases (crosswalk, LiveOutputs alias column). Open review rows: excel_ai/plans/TODO_Codes.md.</w:t>
+        <w:t xml:space="preserve">v0.7.2 (codes R0-R9): the prototype codes follow the protocol; legacy codes that differ are aliases (crosswalk, LiveOutputs alias column). Open review rows: excel_ai/plans/TODO_Codes.md.</w:t>
       </w:r>
       <w:r>
         <w:t xml:space="preserve"> </w:t>
@@ -7710,7 +7772,7 @@
         <w:t xml:space="preserve"> </w:t>
       </w:r>
       <w:r>
-        <w:t xml:space="preserve">Modelled v6.0: the transfer follows the program’s incidence by quintile (legacy rows 2617-2629; bugs L147-L149 fixed).</w:t>
+        <w:t xml:space="preserve">Modelled v0.6.0: the transfer follows the program’s incidence by quintile (legacy rows 2617-2629; bugs L147-L149 fixed).</w:t>
       </w:r>
       <w:r>
         <w:t xml:space="preserve"> </w:t>
@@ -7760,7 +7822,7 @@
         <w:t xml:space="preserve"> </w:t>
       </w:r>
       <w:r>
-        <w:t xml:space="preserve">Modelled v6.0: the transfer weights each decile by its share below the line (HHSurvey pct_belowpl_</w:t>
+        <w:t xml:space="preserve">Modelled v0.6.0: the transfer weights each decile by its share below the line (HHSurvey pct_belowpl_</w:t>
       </w:r>
       <w:r>
         <w:rPr>
@@ -7861,7 +7923,7 @@
         <w:t xml:space="preserve"> </w:t>
       </w:r>
       <w:r>
-        <w:t xml:space="preserve">Modelled v6.0 (legacy row 2685): the money not paid is not redistributed, as legacy.</w:t>
+        <w:t xml:space="preserve">Modelled v0.6.0 (legacy row 2685): the money not paid is not redistributed, as legacy.</w:t>
       </w:r>
       <w:r>
         <w:t xml:space="preserve"> </w:t>
@@ -9553,7 +9615,7 @@
         <w:t xml:space="preserve"> </w:t>
       </w:r>
       <w:r>
-        <w:t xml:space="preserve">Replicated 0 (v9.0, R3.12: electricity entx unchanged); filling it would tax power-plant air pollution twice.</w:t>
+        <w:t xml:space="preserve">Replicated 0 (v0.9.0, R3.12: electricity entx unchanged); filling it would tax power-plant air pollution twice.</w:t>
       </w:r>
       <w:r>
         <w:t xml:space="preserve"> </w:t>
@@ -10786,7 +10848,7 @@
         <w:t xml:space="preserve"> </w:t>
       </w:r>
       <w:r>
-        <w:t xml:space="preserve">K1793 = basket budget share x total consumption is the economy-wide spend; with mean budget shares the ten decile parts do not sum to 1 (Egypt LPG: sum of deciles / basket = 0.822). Egypt, 4 deciles, LPG: legacy 27.26%, prototype before v9.0 33.16% (sum of deciles). Replicated in v9.0 (Settings C83, R6.3).</w:t>
+        <w:t xml:space="preserve">K1793 = basket budget share x total consumption is the economy-wide spend; with mean budget shares the ten decile parts do not sum to 1 (Egypt LPG: sum of deciles / basket = 0.822). Egypt, 4 deciles, LPG: legacy 27.26%, prototype before v0.9.0 33.16% (sum of deciles). Replicated in v0.9.0 (Settings C83, R6.3).</w:t>
       </w:r>
       <w:r>
         <w:t xml:space="preserve"> </w:t>
@@ -10818,7 +10880,7 @@
         <w:t xml:space="preserve"> </w:t>
       </w:r>
       <w:r>
-        <w:t xml:space="preserve">Replicated (v9.0, R6.3): Settings C83 basket denominator; Egypt 4 deciles LPG 0.27259 = legacy 0.2726.</w:t>
+        <w:t xml:space="preserve">Replicated (v0.9.0, R6.3): Settings C83 basket denominator; Egypt 4 deciles LPG 0.27259 = legacy 0.2726.</w:t>
       </w:r>
       <w:r>
         <w:t xml:space="preserve"> </w:t>
@@ -10882,7 +10944,7 @@
         <w:t xml:space="preserve"> </w:t>
       </w:r>
       <w:r>
-        <w:t xml:space="preserve">when the WHOCooking code is missing; the prototype before v9.0 gave “” (Settings C65; affects leakage too). Replicated in v9.0 (R6.1).</w:t>
+        <w:t xml:space="preserve">when the WHOCooking code is missing; the prototype before v0.9.0 gave “” (Settings C65; affects leakage too). Replicated in v0.9.0 (R6.1).</w:t>
       </w:r>
       <w:r>
         <w:t xml:space="preserve"> </w:t>
@@ -10914,7 +10976,7 @@
         <w:t xml:space="preserve"> </w:t>
       </w:r>
       <w:r>
-        <w:t xml:space="preserve">Replicated (v9.0, R6.1): Settings C65 fallback</w:t>
+        <w:t xml:space="preserve">Replicated (v0.9.0, R6.1): Settings C65 fallback</w:t>
       </w:r>
       <w:r>
         <w:t xml:space="preserve"> </w:t>
@@ -10995,7 +11057,7 @@
         <w:t xml:space="preserve"> </w:t>
       </w:r>
       <w:r>
-        <w:t xml:space="preserve">Replicated (v9.0, R6.7): lkd on the not-exempt use.</w:t>
+        <w:t xml:space="preserve">Replicated (v0.9.0, R6.7): lkd on the not-exempt use.</w:t>
       </w:r>
       <w:r>
         <w:t xml:space="preserve"> </w:t>
@@ -11661,7 +11723,7 @@
         <w:t xml:space="preserve"> </w:t>
       </w:r>
       <w:r>
-        <w:t xml:space="preserve">Resolved in v9.0 (EF465): the cause was the emission factors (our L58/L59 fallback gave food &amp; forestry diesel the construction factor, 2.51 t BC/ktoe against legacy 465’s regional 0.0044); with the 465 lookup section 15 equals legacy in 2022 (food &amp; forestry BC 3.8 t) and modelled PM2.5 is 33.06 against 30.17 ug/m3 (the difference: navigation, L22).</w:t>
+        <w:t xml:space="preserve">Resolved in v0.9.0 (EF465): the cause was the emission factors (our L58/L59 fallback gave food &amp; forestry diesel the construction factor, 2.51 t BC/ktoe against legacy 465’s regional 0.0044); with the 465 lookup section 15 equals legacy in 2022 (food &amp; forestry BC 3.8 t) and modelled PM2.5 is 33.06 against 30.17 ug/m3 (the difference: navigation, L22).</w:t>
       </w:r>
       <w:r>
         <w:t xml:space="preserve"> </w:t>
@@ -11841,6 +11903,72 @@
       </w:r>
       <w:r>
         <w:t xml:space="preserve">Accepted.</w:t>
+      </w:r>
+    </w:p>
+    <w:p>
+      <w:pPr>
+        <w:pStyle w:val="BodyText"/>
+      </w:pPr>
+      <w:r>
+        <w:rPr>
+          <w:bCs/>
+          <w:b/>
+        </w:rPr>
+        <w:t xml:space="preserve">I152. Methane abatement curves: no fallback to the Average coefficients.</w:t>
+      </w:r>
+      <w:r>
+        <w:t xml:space="preserve"> </w:t>
+      </w:r>
+      <w:r>
+        <w:t xml:space="preserve">Legacy takes each abatement-curve coefficient (a, b) of the country, and the Average row where the country value is 0 or missing (Mitigation L6084:M6084 and the rows of the other sources: IF(country = 0, Average, IFNA(country, Average))). The prototype reads the country value, 0 when missing (section 14 ch4.abt D:E). Example: DMA livestock b = 0 (legacy: the Average b, 0.7005). Egypt: none (its coefficients are non-zero).</w:t>
+      </w:r>
+      <w:r>
+        <w:t xml:space="preserve"> </w:t>
+      </w:r>
+      <w:r>
+        <w:rPr>
+          <w:iCs/>
+          <w:i/>
+        </w:rPr>
+        <w:t xml:space="preserve">In the prototype:</w:t>
+      </w:r>
+      <w:r>
+        <w:t xml:space="preserve"> </w:t>
+      </w:r>
+      <w:r>
+        <w:t xml:space="preserve">Not replicated yet: queued to be replicated (no user decision).</w:t>
+      </w:r>
+      <w:r>
+        <w:t xml:space="preserve"> </w:t>
+      </w:r>
+      <w:r>
+        <w:rPr>
+          <w:iCs/>
+          <w:i/>
+        </w:rPr>
+        <w:t xml:space="preserve">Next step:</w:t>
+      </w:r>
+      <w:r>
+        <w:t xml:space="preserve"> </w:t>
+      </w:r>
+      <w:r>
+        <w:t xml:space="preserve">Departure not decided by the user: queued to be replicated (NORMS 0): take the Average row where the country coefficient is 0 or missing, as legacy.</w:t>
+      </w:r>
+      <w:r>
+        <w:t xml:space="preserve"> </w:t>
+      </w:r>
+      <w:r>
+        <w:rPr>
+          <w:iCs/>
+          <w:i/>
+        </w:rPr>
+        <w:t xml:space="preserve">Status:</w:t>
+      </w:r>
+      <w:r>
+        <w:t xml:space="preserve"> </w:t>
+      </w:r>
+      <w:r>
+        <w:t xml:space="preserve">Open.</w:t>
       </w:r>
     </w:p>
     <w:bookmarkEnd w:id="36"/>
@@ -11989,7 +12117,7 @@
               <w:jc w:val="left"/>
             </w:pPr>
             <w:r>
-              <w:t xml:space="preserve">User decision v0.10: the legacy rule drove the retail price to the 0.01 floor and fuel use 10x by 2030</w:t>
+              <w:t xml:space="preserve">User decision v0.0.10: the legacy rule drove the retail price to the 0.01 floor and fuel use 10x by 2030</w:t>
             </w:r>
           </w:p>
         </w:tc>
@@ -12039,19 +12167,19 @@
               <w:jc w:val="left"/>
             </w:pPr>
             <w:r>
-              <w:t xml:space="preserve">Legacy: 0. Prototype: General VAT rate VAT_WEO for residential coal and gas and all-sector oil products; 0 for power, industry, biomass. Only for blank cells (v0.14).</w:t>
-            </w:r>
-          </w:p>
-        </w:tc>
-        <w:tc>
-          <w:tcPr/>
-          <w:p>
-            <w:pPr>
-              <w:pStyle w:val="Compact"/>
-              <w:jc w:val="left"/>
-            </w:pPr>
-            <w:r>
-              <w:t xml:space="preserve">Legacy bug L170 (v8.5, user 2026-10-29; was data bug DB2): a blank is a missing value, not a zero; the data problem is issue I97 (very high)</w:t>
+              <w:t xml:space="preserve">Legacy: 0. Prototype: General VAT rate VAT_WEO for residential coal and gas and all-sector oil products; 0 for power, industry, biomass. Only for blank cells (v0.0.14).</w:t>
+            </w:r>
+          </w:p>
+        </w:tc>
+        <w:tc>
+          <w:tcPr/>
+          <w:p>
+            <w:pPr>
+              <w:pStyle w:val="Compact"/>
+              <w:jc w:val="left"/>
+            </w:pPr>
+            <w:r>
+              <w:t xml:space="preserve">Legacy bug L170 (v0.8.5, user 2026-10-29; was data bug DB2): a blank is a missing value, not a zero; the data problem is issue I97 (very high)</w:t>
             </w:r>
           </w:p>
         </w:tc>
@@ -12101,7 +12229,7 @@
               <w:jc w:val="left"/>
             </w:pPr>
             <w:r>
-              <w:t xml:space="preserve">Legacy: VAT rate x oil-product share. Prototype: VAT rate x household share of the oil product (sheet OilProductShares, as legacy rows 801-816; v4.12); VAT payment = (supply cost + taxes) x rate x share.</w:t>
+              <w:t xml:space="preserve">Legacy: VAT rate x oil-product share. Prototype: VAT rate x household share of the oil product (sheet OilProductShares, as legacy rows 801-816; v0.4.12); VAT payment = (supply cost + taxes) x rate x share.</w:t>
             </w:r>
           </w:p>
         </w:tc>
@@ -12252,7 +12380,7 @@
               <w:jc w:val="left"/>
             </w:pPr>
             <w:r>
-              <w:t xml:space="preserve">Legacy bug L15: the relative price is a hardcoded 1.1 and the volatility inputs are not used (user suggestion v1.02: volatility-dependent effectiveness)</w:t>
+              <w:t xml:space="preserve">Legacy bug L15: the relative price is a hardcoded 1.1 and the volatility inputs are not used (user suggestion v0.1.02: volatility-dependent effectiveness)</w:t>
             </w:r>
           </w:p>
         </w:tc>
@@ -12302,7 +12430,7 @@
               <w:jc w:val="left"/>
             </w:pPr>
             <w:r>
-              <w:t xml:space="preserve">Legacy: Per instrument: carbon price and fuel price reform follow the ExtendCarbonPriceBeyondOutro switch (reform: 0 under No, rate x last year under Percentage); feebates constant. Prototype: The same (v9.0; v0.8-v8.5: linear for the reform and feebates); legacy bugs L171 (hold the target under No) and L173 (1 + rate) fixed; ETS benchmarks constant; ETS cap per MTInputs switch.</w:t>
+              <w:t xml:space="preserve">Legacy: Per instrument: carbon price and fuel price reform follow the ExtendCarbonPriceBeyondOutro switch (reform: 0 under No, rate x last year under Percentage); feebates constant. Prototype: The same (v0.9.0; v0.0.8-v0.8.5: linear for the reform and feebates); legacy bugs L171 (hold the target under No) and L173 (1 + rate) fixed; ETS benchmarks constant; ETS cap per MTInputs switch.</w:t>
             </w:r>
           </w:p>
         </w:tc>
@@ -12376,7 +12504,7 @@
               <w:jc w:val="left"/>
             </w:pPr>
             <w:r>
-              <w:t xml:space="preserve">User decision v0.8</w:t>
+              <w:t xml:space="preserve">User decision v0.0.8</w:t>
             </w:r>
           </w:p>
         </w:tc>
@@ -12438,7 +12566,7 @@
               <w:jc w:val="left"/>
             </w:pPr>
             <w:r>
-              <w:t xml:space="preserve">User rule v2.4</w:t>
+              <w:t xml:space="preserve">User rule v0.2.4</w:t>
             </w:r>
           </w:p>
         </w:tc>
@@ -12500,7 +12628,7 @@
               <w:jc w:val="left"/>
             </w:pPr>
             <w:r>
-              <w:t xml:space="preserve">User rule v2.4</w:t>
+              <w:t xml:space="preserve">User rule v0.2.4</w:t>
             </w:r>
           </w:p>
         </w:tc>
@@ -12550,7 +12678,7 @@
               <w:jc w:val="left"/>
             </w:pPr>
             <w:r>
-              <w:t xml:space="preserve">Legacy: Coal and gas margin read at 2024 (typed), oil products at the base year; production cost weighted by the share produced domestically; both added unconverted (nominal). Prototype: The same years and weight (v9.0), converted to real with the CPI index of the year read.</w:t>
+              <w:t xml:space="preserve">Legacy: Coal and gas margin read at 2024 (typed), oil products at the base year; production cost weighted by the share produced domestically; both added unconverted (nominal). Prototype: The same years and weight (v0.9.0), converted to real with the CPI index of the year read.</w:t>
             </w:r>
           </w:p>
         </w:tc>
@@ -12600,31 +12728,31 @@
               <w:jc w:val="left"/>
             </w:pPr>
             <w:r>
-              <w:t xml:space="preserve">Power: bug fixes (v1.06)</w:t>
-            </w:r>
-          </w:p>
-        </w:tc>
-        <w:tc>
-          <w:tcPr/>
-          <w:p>
-            <w:pPr>
-              <w:pStyle w:val="Compact"/>
-              <w:jc w:val="left"/>
-            </w:pPr>
-            <w:r>
-              <w:t xml:space="preserve">Legacy: Ten defects (CPAT-AI-Mitigation-Prototype_BugsIssuesUpgrades_v6.4.docx): services demand with the industrial multiple from 2024; efficiency exponent with eps_F; income factor twice; LT storage allocation twice; investment spending at base capital cost; investment logit normalised by non-permitted types; early-retirement units; coal effective retirement uncapped; feebate rebate x 1.22; capacity check on the plan; v4.14: new capacity sized for this year’s demand although it comes online next year (L67, was I8). Prototype: Fixed.</w:t>
-            </w:r>
-          </w:p>
-        </w:tc>
-        <w:tc>
-          <w:tcPr/>
-          <w:p>
-            <w:pPr>
-              <w:pStyle w:val="Compact"/>
-              <w:jc w:val="left"/>
-            </w:pPr>
-            <w:r>
-              <w:t xml:space="preserve">User request v1.06; L67 by user decision 2026-10-18</w:t>
+              <w:t xml:space="preserve">Power: bug fixes (v0.1.06)</w:t>
+            </w:r>
+          </w:p>
+        </w:tc>
+        <w:tc>
+          <w:tcPr/>
+          <w:p>
+            <w:pPr>
+              <w:pStyle w:val="Compact"/>
+              <w:jc w:val="left"/>
+            </w:pPr>
+            <w:r>
+              <w:t xml:space="preserve">Legacy: Ten defects (CPAT-AI-Mitigation-Prototype_BugsIssuesUpgrades_v0.6.4.docx): services demand with the industrial multiple from 2024; efficiency exponent with eps_F; income factor twice; LT storage allocation twice; investment spending at base capital cost; investment logit normalised by non-permitted types; early-retirement units; coal effective retirement uncapped; feebate rebate x 1.22; capacity check on the plan; v0.4.14: new capacity sized for this year’s demand although it comes online next year (L67, was I8). Prototype: Fixed.</w:t>
+            </w:r>
+          </w:p>
+        </w:tc>
+        <w:tc>
+          <w:tcPr/>
+          <w:p>
+            <w:pPr>
+              <w:pStyle w:val="Compact"/>
+              <w:jc w:val="left"/>
+            </w:pPr>
+            <w:r>
+              <w:t xml:space="preserve">User request v0.1.06; L67 by user decision 2026-10-18</w:t>
             </w:r>
           </w:p>
         </w:tc>
@@ -12674,7 +12802,7 @@
               <w:jc w:val="left"/>
             </w:pPr>
             <w:r>
-              <w:t xml:space="preserve">Legacy: Power demand from the elasticity model, carbon price on power use (feebate on demand). Prototype: Dropped (user decisions 4 and 5 of the power plan; the rebate covers the demand-side feebate). Built: v5.4 PPAs, deficit to gas, renewable subsidies, rebate, electricity excise, every power input by scenario; v5.6 manual capacity and investment (P3: rows mancap, mani, needm; Manual inputs 349-357 scenario 1, 363-371 other scenarios; legacy bug L118 fixed: logit investment sized on the need net of manual investment).</w:t>
+              <w:t xml:space="preserve">Legacy: Power demand from the elasticity model, carbon price on power use (feebate on demand). Prototype: Dropped (user decisions 4 and 5 of the power plan; the rebate covers the demand-side feebate). Built: v0.5.4 PPAs, deficit to gas, renewable subsidies, rebate, electricity excise, every power input by scenario; v0.5.6 manual capacity and investment (P3: rows mancap, mani, needm; Manual inputs 349-357 scenario 1, 363-371 other scenarios; legacy bug L118 fixed: logit investment sized on the need net of manual investment).</w:t>
             </w:r>
           </w:p>
         </w:tc>
@@ -12736,7 +12864,7 @@
               <w:jc w:val="left"/>
             </w:pPr>
             <w:r>
-              <w:t xml:space="preserve">Legacy: ECP data by country (national and regional ETS blocks, carbon tax with fuel-specific rates), coverage by year; ctx and ets inside txo; free allocation and revenue data. Prototype: As legacy (v4.12): carbon tax with the single rate or fuel rates (single price? flag), national ETS and the EU ETS (EU ETS? = Yes or Both) added up, coverage of each data year (blank = 0), the last data year after; each scheme read from its own block of sheet ECP; the sector of the price fuel (oil products: transport; other oil products: industry); only the change against the level in the price data enters prices and revenue (legacy: ctx and ets inside txo, same numbers); existing ETS revenue at full price and free-allocation and revenue data unused, as legacy.</w:t>
+              <w:t xml:space="preserve">Legacy: ECP data by country (national and regional ETS blocks, carbon tax with fuel-specific rates), coverage by year; ctx and ets inside txo; free allocation and revenue data. Prototype: As legacy (v0.4.12): carbon tax with the single rate or fuel rates (single price? flag), national ETS and the EU ETS (EU ETS? = Yes or Both) added up, coverage of each data year (blank = 0), the last data year after; each scheme read from its own block of sheet ECP; the sector of the price fuel (oil products: transport; other oil products: industry); only the change against the level in the price data enters prices and revenue (legacy: ctx and ets inside txo, same numbers); existing ETS revenue at full price and free-allocation and revenue data unused, as legacy.</w:t>
             </w:r>
           </w:p>
         </w:tc>
@@ -12798,19 +12926,19 @@
               <w:jc w:val="left"/>
             </w:pPr>
             <w:r>
-              <w:t xml:space="preserve">Legacy: To 2050 (power block to 2041); CPI held flat after 2031. Prototype: To 2041 (v2.3; the last year is the LAMBDA year); same indices; values after 2030 not a legacy target.</w:t>
-            </w:r>
-          </w:p>
-        </w:tc>
-        <w:tc>
-          <w:tcPr/>
-          <w:p>
-            <w:pPr>
-              <w:pStyle w:val="Compact"/>
-              <w:jc w:val="left"/>
-            </w:pPr>
-            <w:r>
-              <w:t xml:space="preserve">User decisions v0.9 / v0.11 / v2.3</w:t>
+              <w:t xml:space="preserve">Legacy: To 2050 (power block to 2041); CPI held flat after 2031. Prototype: To 2041 (v0.2.3; the last year is the LAMBDA year); same indices; values after 2030 not a legacy target.</w:t>
+            </w:r>
+          </w:p>
+        </w:tc>
+        <w:tc>
+          <w:tcPr/>
+          <w:p>
+            <w:pPr>
+              <w:pStyle w:val="Compact"/>
+              <w:jc w:val="left"/>
+            </w:pPr>
+            <w:r>
+              <w:t xml:space="preserve">User decisions v0.0.9 / v0.0.11 / v0.2.3</w:t>
             </w:r>
           </w:p>
         </w:tc>
@@ -12848,7 +12976,7 @@
               <w:jc w:val="left"/>
             </w:pPr>
             <w:r>
-              <w:t xml:space="preserve">GHGs: non-energy methane (v2.8)</w:t>
+              <w:t xml:space="preserve">GHGs: non-energy methane (v0.2.8)</w:t>
             </w:r>
           </w:p>
         </w:tc>
@@ -12910,7 +13038,7 @@
               <w:jc w:val="left"/>
             </w:pPr>
             <w:r>
-              <w:t xml:space="preserve">GHGs: flaring (v2.8)</w:t>
+              <w:t xml:space="preserve">GHGs: flaring (v0.2.8)</w:t>
             </w:r>
           </w:p>
         </w:tc>
@@ -12972,7 +13100,7 @@
               <w:jc w:val="left"/>
             </w:pPr>
             <w:r>
-              <w:t xml:space="preserve">GHGs: population (v2.8)</w:t>
+              <w:t xml:space="preserve">GHGs: population (v0.2.8)</w:t>
             </w:r>
           </w:p>
         </w:tc>
@@ -13034,7 +13162,7 @@
               <w:jc w:val="left"/>
             </w:pPr>
             <w:r>
-              <w:t xml:space="preserve">Local pollutants: navigation (v2.9)</w:t>
+              <w:t xml:space="preserve">Local pollutants: navigation (v0.2.9)</w:t>
             </w:r>
           </w:p>
         </w:tc>
@@ -13096,7 +13224,7 @@
               <w:jc w:val="left"/>
             </w:pPr>
             <w:r>
-              <w:t xml:space="preserve">Local pollutants: total (v3.0)</w:t>
+              <w:t xml:space="preserve">Local pollutants: total (v0.3.0)</w:t>
             </w:r>
           </w:p>
         </w:tc>
@@ -13158,7 +13286,7 @@
               <w:jc w:val="left"/>
             </w:pPr>
             <w:r>
-              <w:t xml:space="preserve">GDP effects: feedback (v3.1)</w:t>
+              <w:t xml:space="preserve">GDP effects: feedback (v0.3.1)</w:t>
             </w:r>
           </w:p>
         </w:tc>
@@ -13182,7 +13310,7 @@
               <w:jc w:val="left"/>
             </w:pPr>
             <w:r>
-              <w:t xml:space="preserve">Legacy bug L24 (user decision v3.1: fix)</w:t>
+              <w:t xml:space="preserve">Legacy bug L24 (user decision v0.3.1: fix)</w:t>
             </w:r>
           </w:p>
         </w:tc>
@@ -13220,7 +13348,7 @@
               <w:jc w:val="left"/>
             </w:pPr>
             <w:r>
-              <w:t xml:space="preserve">Road transport: engineer model (v3.5)</w:t>
+              <w:t xml:space="preserve">Road transport: engineer model (v0.3.5)</w:t>
             </w:r>
           </w:p>
         </w:tc>
@@ -13282,7 +13410,7 @@
               <w:jc w:val="left"/>
             </w:pPr>
             <w:r>
-              <w:t xml:space="preserve">Road transport: policy inputs (v3.5)</w:t>
+              <w:t xml:space="preserve">Road transport: policy inputs (v0.3.5)</w:t>
             </w:r>
           </w:p>
         </w:tc>
@@ -13344,7 +13472,7 @@
               <w:jc w:val="left"/>
             </w:pPr>
             <w:r>
-              <w:t xml:space="preserve">Road transport: inputs from the rest of the model (v3.5)</w:t>
+              <w:t xml:space="preserve">Road transport: inputs from the rest of the model (v0.3.5)</w:t>
             </w:r>
           </w:p>
         </w:tc>
@@ -13406,7 +13534,7 @@
               <w:jc w:val="left"/>
             </w:pPr>
             <w:r>
-              <w:t xml:space="preserve">Road transport: kept as legacy (v3.5)</w:t>
+              <w:t xml:space="preserve">Road transport: kept as legacy (v0.3.5)</w:t>
             </w:r>
           </w:p>
         </w:tc>
@@ -13468,7 +13596,7 @@
               <w:jc w:val="left"/>
             </w:pPr>
             <w:r>
-              <w:t xml:space="preserve">ETS goal-seek settings (v5.2)</w:t>
+              <w:t xml:space="preserve">ETS goal-seek settings (v0.5.2)</w:t>
             </w:r>
           </w:p>
         </w:tc>
@@ -13495,7 +13623,7 @@
               <w:t xml:space="preserve">’</w:t>
             </w:r>
             <w:r>
-              <w:t xml:space="preserve">, ETSErrorTolerance 0.001), read by the VBA goal seek (SolveFast). Prototype: The same cells and names, read by the macro SolveETS and ets_goalseek.py (before v5.2: constants in the code); values 20, Continue, 0.005, the prototype error being the worst yearly /covered / cap - 1/; StartFresh starts from the fast estimate ets.est, Continue from the override row if it holds prices.</w:t>
+              <w:t xml:space="preserve">, ETSErrorTolerance 0.001), read by the VBA goal seek (SolveFast). Prototype: The same cells and names, read by the macro SolveETS and ets_goalseek.py (before v0.5.2: constants in the code); values 20, Continue, 0.005, the prototype error being the worst yearly /covered / cap - 1/; StartFresh starts from the fast estimate ets.est, Continue from the override row if it holds prices.</w:t>
             </w:r>
           </w:p>
         </w:tc>
@@ -13545,7 +13673,7 @@
               <w:jc w:val="left"/>
             </w:pPr>
             <w:r>
-              <w:t xml:space="preserve">Non-energy GHG elasticities (v5.2)</w:t>
+              <w:t xml:space="preserve">Non-energy GHG elasticities (v0.5.2)</w:t>
             </w:r>
           </w:p>
         </w:tc>
@@ -13590,7 +13718,7 @@
               <w:t xml:space="preserve"> </w:t>
             </w:r>
             <w:r>
-              <w:t xml:space="preserve">= 0) by the rows ghg.dr and ch4.act of section 14; before v5.2 sheet Constants (ghg.el).</w:t>
+              <w:t xml:space="preserve">= 0) by the rows ghg.dr and ch4.act of section 14; before v0.5.2 sheet Constants (ghg.el).</w:t>
             </w:r>
           </w:p>
         </w:tc>
@@ -13640,7 +13768,7 @@
               <w:jc w:val="left"/>
             </w:pPr>
             <w:r>
-              <w:t xml:space="preserve">Power: inputs by scenario (v5.4, P2)</w:t>
+              <w:t xml:space="preserve">Power: inputs by scenario (v0.5.4, P2)</w:t>
             </w:r>
           </w:p>
         </w:tc>
@@ -13702,7 +13830,7 @@
               <w:jc w:val="left"/>
             </w:pPr>
             <w:r>
-              <w:t xml:space="preserve">Power: renewable subsidies (v5.4)</w:t>
+              <w:t xml:space="preserve">Power: renewable subsidies (v0.5.4)</w:t>
             </w:r>
           </w:p>
         </w:tc>
@@ -13782,7 +13910,7 @@
               <w:jc w:val="left"/>
             </w:pPr>
             <w:r>
-              <w:t xml:space="preserve">Power: revenue rebate and electricity excise (v5.4)</w:t>
+              <w:t xml:space="preserve">Power: revenue rebate and electricity excise (v0.5.4)</w:t>
             </w:r>
           </w:p>
         </w:tc>
@@ -13844,7 +13972,7 @@
               <w:jc w:val="left"/>
             </w:pPr>
             <w:r>
-              <w:t xml:space="preserve">Power: capex decline options Low and Vhigh (v5.4)</w:t>
+              <w:t xml:space="preserve">Power: capex decline options Low and Vhigh (v0.5.4)</w:t>
             </w:r>
           </w:p>
         </w:tc>
@@ -13924,7 +14052,7 @@
               <w:jc w:val="left"/>
             </w:pPr>
             <w:r>
-              <w:t xml:space="preserve">Legacy: wel.air and the road co-benefits from the Air pollution and Transport sheets’ own runs (wel.air from AP 3217); unit-cost bugs L189, L190, L191, L192, L193. Prototype: wel.usd = climate + air pollution (value per ug/m3 x change in the modelled PM2.5 of the prototype’s emissions, section 17b) + road co-benefits (accidents, congestion, road damage per litre) - efficiency costs (v9.0, R1-R2); typed Egypt inputs on the module tabs FromAirPollution and FromTransportCB (other countries 0).</w:t>
+              <w:t xml:space="preserve">Legacy: wel.air and the road co-benefits from the Air pollution and Transport sheets’ own runs (wel.air from AP 3217); unit-cost bugs L189, L190, L191, L192, L193. Prototype: wel.usd = climate + air pollution (value per ug/m3 x change in the modelled PM2.5 of the prototype’s emissions, section 17b) + road co-benefits (accidents, congestion, road damage per litre) - efficiency costs (v0.9.0, R1-R2); typed Egypt inputs on the module tabs FromAirPollution and FromTransportCB (other countries 0).</w:t>
             </w:r>
           </w:p>
         </w:tc>
@@ -13986,7 +14114,7 @@
               <w:jc w:val="left"/>
             </w:pPr>
             <w:r>
-              <w:t xml:space="preserve">Legacy: Rows 17678-17951 with bugs L176, L177, L178, L179, L180, L181, L182, L183, L184, L185, L186, L187, L188. Prototype: Section 18 (v9.0, R2): climate costs per GJ, own-sector quantities, consumption-weighted other lines, GDP of the year; explicit and implicit subsidies (16 lines x 8 variables) in every scenario group (I110).</w:t>
+              <w:t xml:space="preserve">Legacy: Rows 17678-17951 with bugs L176, L177, L178, L179, L180, L181, L182, L183, L184, L185, L186, L187, L188. Prototype: Section 18 (v0.9.0, R2): climate costs per GJ, own-sector quantities, consumption-weighted other lines, GDP of the year; explicit and implicit subsidies (16 lines x 8 variables) in every scenario group (I110).</w:t>
             </w:r>
           </w:p>
         </w:tc>
@@ -14048,7 +14176,7 @@
               <w:jc w:val="left"/>
             </w:pPr>
             <w:r>
-              <w:t xml:space="preserve">Legacy: Rows 18180-18198: #NAME?/#N/A (stale WEO codes, L50); 18195 leaves coal out (L214); gas bill x $/MMBtu (L215). Prototype: Section 16b rows bca.* (v9.0, R11): typed WEO values for Egypt (held at 2031), change = - xnim by fuel group, % of GDP over the implied GDP, coal included; other countries 0 (I148).</w:t>
+              <w:t xml:space="preserve">Legacy: Rows 18180-18198: #NAME?/#N/A (stale WEO codes, L50); 18195 leaves coal out (L214); gas bill x $/MMBtu (L215). Prototype: Section 16b rows bca.* (v0.9.0, R11): typed WEO values for Egypt (held at 2031), change = - xnim by fuel group, % of GDP over the implied GDP, coal included; other countries 0 (I148).</w:t>
             </w:r>
           </w:p>
         </w:tc>
@@ -14172,7 +14300,7 @@
               <w:jc w:val="left"/>
             </w:pPr>
             <w:r>
-              <w:t xml:space="preserve">Legacy: Average damages per fuel (attributed deaths per ktoe x VSL; AP 3731-4378), used in the Pigouvian taxes, efficient prices, implicit subsidies and FFS. Prototype: Marginal damages (v9.0): value of averted PM2.5 x concentration coefficients x emission factors, lines weighted by fuel use; legacy values kept as a memo on FromAirPollution.</w:t>
+              <w:t xml:space="preserve">Legacy: Average damages per fuel (attributed deaths per ktoe x VSL; AP 3731-4378), used in the Pigouvian taxes, efficient prices, implicit subsidies and FFS. Prototype: Marginal damages (v0.9.0): value of averted PM2.5 x concentration coefficients x emission factors, lines weighted by fuel use; legacy values kept as a memo on FromAirPollution.</w:t>
             </w:r>
           </w:p>
         </w:tc>
@@ -14511,7 +14639,7 @@
               <w:jc w:val="left"/>
             </w:pPr>
             <w:r>
-              <w:t xml:space="preserve">CH4 and N2O done (v2.8), local pollutants (v2.9); inventory-adjusted EFs and process CO2 remain.</w:t>
+              <w:t xml:space="preserve">CH4 and N2O done (v0.2.8), local pollutants (v0.2.9); inventory-adjusted EFs and process CO2 remain.</w:t>
             </w:r>
           </w:p>
         </w:tc>
@@ -14853,7 +14981,7 @@
               <w:jc w:val="left"/>
             </w:pPr>
             <w:r>
-              <w:t xml:space="preserve">Fixed (v0.3-v0.4 / v0.5)</w:t>
+              <w:t xml:space="preserve">Fixed (v0.0.3-v0.0.4 / v0.0.5)</w:t>
             </w:r>
           </w:p>
         </w:tc>
@@ -14915,7 +15043,7 @@
               <w:jc w:val="left"/>
             </w:pPr>
             <w:r>
-              <w:t xml:space="preserve">Fixed (v1.05 / v1.06)</w:t>
+              <w:t xml:space="preserve">Fixed (v0.1.05 / v0.1.06)</w:t>
             </w:r>
           </w:p>
         </w:tc>
@@ -14977,7 +15105,7 @@
               <w:jc w:val="left"/>
             </w:pPr>
             <w:r>
-              <w:t xml:space="preserve">Fixed (v1.05 / v1.06)</w:t>
+              <w:t xml:space="preserve">Fixed (v0.1.05 / v0.1.06)</w:t>
             </w:r>
           </w:p>
         </w:tc>
@@ -15072,7 +15200,7 @@
               <w:jc w:val="left"/>
             </w:pPr>
             <w:r>
-              <w:t xml:space="preserve">Fixed (v1.05 / v1.06)</w:t>
+              <w:t xml:space="preserve">Fixed (v0.1.05 / v0.1.06)</w:t>
             </w:r>
           </w:p>
         </w:tc>
@@ -15134,7 +15262,7 @@
               <w:jc w:val="left"/>
             </w:pPr>
             <w:r>
-              <w:t xml:space="preserve">Fixed (v1.07 build / v1.07)</w:t>
+              <w:t xml:space="preserve">Fixed (v0.1.07 build / v0.1.07)</w:t>
             </w:r>
           </w:p>
         </w:tc>
@@ -15196,7 +15324,7 @@
               <w:jc w:val="left"/>
             </w:pPr>
             <w:r>
-              <w:t xml:space="preserve">Fixed (v1.05 / v1.09)</w:t>
+              <w:t xml:space="preserve">Fixed (v0.1.05 / v0.1.09)</w:t>
             </w:r>
           </w:p>
         </w:tc>
@@ -15258,7 +15386,7 @@
               <w:jc w:val="left"/>
             </w:pPr>
             <w:r>
-              <w:t xml:space="preserve">Fixed (v1.08 / v1.09)</w:t>
+              <w:t xml:space="preserve">Fixed (v0.1.08 / v0.1.09)</w:t>
             </w:r>
           </w:p>
         </w:tc>
@@ -15320,7 +15448,7 @@
               <w:jc w:val="left"/>
             </w:pPr>
             <w:r>
-              <w:t xml:space="preserve">Fixed (v1.09 / v2.2)</w:t>
+              <w:t xml:space="preserve">Fixed (v0.1.09 / v0.2.2)</w:t>
             </w:r>
           </w:p>
         </w:tc>
@@ -15347,7 +15475,7 @@
               <w:t xml:space="preserve">”</w:t>
             </w:r>
             <w:r>
-              <w:t xml:space="preserve">; the formula-structure row described the LAMBDA right column of v1.07.</w:t>
+              <w:t xml:space="preserve">; the formula-structure row described the LAMBDA right column of v0.1.07.</w:t>
             </w:r>
           </w:p>
         </w:tc>
@@ -15385,43 +15513,43 @@
               <w:jc w:val="left"/>
             </w:pPr>
             <w:r>
-              <w:t xml:space="preserve">Legacy comparison note from v1.01</w:t>
-            </w:r>
-          </w:p>
-        </w:tc>
-        <w:tc>
-          <w:tcPr/>
-          <w:p>
-            <w:pPr>
-              <w:pStyle w:val="Compact"/>
-              <w:jc w:val="left"/>
-            </w:pPr>
-            <w:r>
-              <w:t xml:space="preserve">Fixed (v1.02-v1.09 / v2.2)</w:t>
-            </w:r>
-          </w:p>
-        </w:tc>
-        <w:tc>
-          <w:tcPr/>
-          <w:p>
-            <w:pPr>
-              <w:pStyle w:val="Compact"/>
-              <w:jc w:val="left"/>
-            </w:pPr>
-            <w:r>
-              <w:t xml:space="preserve">legacy_comparison described the v1.01 baseline and its script wrote a different file name.</w:t>
-            </w:r>
-          </w:p>
-        </w:tc>
-        <w:tc>
-          <w:tcPr/>
-          <w:p>
-            <w:pPr>
-              <w:pStyle w:val="Compact"/>
-              <w:jc w:val="left"/>
-            </w:pPr>
-            <w:r>
-              <w:t xml:space="preserve">Re-run on v2.2 (legacy_comparison_v6_4.md).</w:t>
+              <w:t xml:space="preserve">Legacy comparison note from v0.1.01</w:t>
+            </w:r>
+          </w:p>
+        </w:tc>
+        <w:tc>
+          <w:tcPr/>
+          <w:p>
+            <w:pPr>
+              <w:pStyle w:val="Compact"/>
+              <w:jc w:val="left"/>
+            </w:pPr>
+            <w:r>
+              <w:t xml:space="preserve">Fixed (v0.1.02-v0.1.09 / v0.2.2)</w:t>
+            </w:r>
+          </w:p>
+        </w:tc>
+        <w:tc>
+          <w:tcPr/>
+          <w:p>
+            <w:pPr>
+              <w:pStyle w:val="Compact"/>
+              <w:jc w:val="left"/>
+            </w:pPr>
+            <w:r>
+              <w:t xml:space="preserve">legacy_comparison described the v0.1.01 baseline and its script wrote a different file name.</w:t>
+            </w:r>
+          </w:p>
+        </w:tc>
+        <w:tc>
+          <w:tcPr/>
+          <w:p>
+            <w:pPr>
+              <w:pStyle w:val="Compact"/>
+              <w:jc w:val="left"/>
+            </w:pPr>
+            <w:r>
+              <w:t xml:space="preserve">Re-run on v0.2.2 (legacy_comparison_v6_4.md).</w:t>
             </w:r>
           </w:p>
         </w:tc>
@@ -15471,19 +15599,19 @@
               <w:jc w:val="left"/>
             </w:pPr>
             <w:r>
-              <w:t xml:space="preserve">Fixed (v1.09 / v2.3)</w:t>
-            </w:r>
-          </w:p>
-        </w:tc>
-        <w:tc>
-          <w:tcPr/>
-          <w:p>
-            <w:pPr>
-              <w:pStyle w:val="Compact"/>
-              <w:jc w:val="left"/>
-            </w:pPr>
-            <w:r>
-              <w:t xml:space="preserve">Since v1.09 the totals (fuel use, CO2, revenues) include power, but the label of the sector code all still said</w:t>
+              <w:t xml:space="preserve">Fixed (v0.1.09 / v0.2.3)</w:t>
+            </w:r>
+          </w:p>
+        </w:tc>
+        <w:tc>
+          <w:tcPr/>
+          <w:p>
+            <w:pPr>
+              <w:pStyle w:val="Compact"/>
+              <w:jc w:val="left"/>
+            </w:pPr>
+            <w:r>
+              <w:t xml:space="preserve">Since v0.1.09 the totals (fuel use, CO2, revenues) include power, but the label of the sector code all still said</w:t>
             </w:r>
             <w:r>
               <w:t xml:space="preserve"> </w:t>
@@ -15563,7 +15691,7 @@
               <w:jc w:val="left"/>
             </w:pPr>
             <w:r>
-              <w:t xml:space="preserve">Fixed (v2.3 build / v2.3)</w:t>
+              <w:t xml:space="preserve">Fixed (v0.2.3 build / v0.2.3)</w:t>
             </w:r>
           </w:p>
         </w:tc>
@@ -15625,19 +15753,19 @@
               <w:jc w:val="left"/>
             </w:pPr>
             <w:r>
-              <w:t xml:space="preserve">Fixed (v3.6 / v3.13)</w:t>
-            </w:r>
-          </w:p>
-        </w:tc>
-        <w:tc>
-          <w:tcPr/>
-          <w:p>
-            <w:pPr>
-              <w:pStyle w:val="Compact"/>
-              <w:jc w:val="left"/>
-            </w:pPr>
-            <w:r>
-              <w:t xml:space="preserve">The tab merge of v3.6 re-pointed every formula but not the formula texts of sheet Lambdas (column F), so the rows reading the power and price inputs named Inputs_power / Inputs_prices, which no longer exist; copied into Mitigation they gave #REF! (found by the full check, variant B).</w:t>
+              <w:t xml:space="preserve">Fixed (v0.3.6 / v0.3.13)</w:t>
+            </w:r>
+          </w:p>
+        </w:tc>
+        <w:tc>
+          <w:tcPr/>
+          <w:p>
+            <w:pPr>
+              <w:pStyle w:val="Compact"/>
+              <w:jc w:val="left"/>
+            </w:pPr>
+            <w:r>
+              <w:t xml:space="preserve">The tab merge of v0.3.6 re-pointed every formula but not the formula texts of sheet Lambdas (column F), so the rows reading the power and price inputs named Inputs_power / Inputs_prices, which no longer exist; copied into Mitigation they gave #REF! (found by the full check, variant B).</w:t>
             </w:r>
           </w:p>
         </w:tc>
@@ -15687,7 +15815,7 @@
               <w:jc w:val="left"/>
             </w:pPr>
             <w:r>
-              <w:t xml:space="preserve">Fixed (v3.5 / v4.16)</w:t>
+              <w:t xml:space="preserve">Fixed (v0.3.5 / v0.4.16)</w:t>
             </w:r>
           </w:p>
         </w:tc>
@@ -15749,19 +15877,19 @@
               <w:jc w:val="left"/>
             </w:pPr>
             <w:r>
-              <w:t xml:space="preserve">Fixed (v4.2 / v5.3)</w:t>
-            </w:r>
-          </w:p>
-        </w:tc>
-        <w:tc>
-          <w:tcPr/>
-          <w:p>
-            <w:pPr>
-              <w:pStyle w:val="Compact"/>
-              <w:jc w:val="left"/>
-            </w:pPr>
-            <w:r>
-              <w:t xml:space="preserve">The 21 LAMBDA-library texts of the power pollutant rows (sheet Lambdas, column C) still named the sheet Inputs_power: the v3.13 fix (M12) re-pointed the texts only on sheets that stay in place, and Lambdas is an appended block since v4.2; pasted, they gave #NAME?.</w:t>
+              <w:t xml:space="preserve">Fixed (v0.4.2 / v0.5.3)</w:t>
+            </w:r>
+          </w:p>
+        </w:tc>
+        <w:tc>
+          <w:tcPr/>
+          <w:p>
+            <w:pPr>
+              <w:pStyle w:val="Compact"/>
+              <w:jc w:val="left"/>
+            </w:pPr>
+            <w:r>
+              <w:t xml:space="preserve">The 21 LAMBDA-library texts of the power pollutant rows (sheet Lambdas, column C) still named the sheet Inputs_power: the v0.3.13 fix (M12) re-pointed the texts only on sheets that stay in place, and Lambdas is an appended block since v0.4.2; pasted, they gave #NAME?.</w:t>
             </w:r>
           </w:p>
         </w:tc>
@@ -15774,6 +15902,529 @@
             </w:pPr>
             <w:r>
               <w:t xml:space="preserve">merge_tabs re-points the Lambdas texts of an appended block too (host Mitigation); the full check lists any text naming a merged-away sheet.</w:t>
+            </w:r>
+          </w:p>
+        </w:tc>
+      </w:tr>
+      <w:tr>
+        <w:tc>
+          <w:tcPr/>
+          <w:p>
+            <w:pPr>
+              <w:pStyle w:val="Compact"/>
+              <w:jc w:val="left"/>
+            </w:pPr>
+            <w:r>
+              <w:t xml:space="preserve">M15</w:t>
+            </w:r>
+          </w:p>
+        </w:tc>
+        <w:tc>
+          <w:tcPr/>
+          <w:p>
+            <w:pPr>
+              <w:pStyle w:val="Compact"/>
+              <w:jc w:val="left"/>
+            </w:pPr>
+            <w:r>
+              <w:t xml:space="preserve">Section 18: VAT on efficient prices at the 2022 general rate in every year</w:t>
+            </w:r>
+          </w:p>
+        </w:tc>
+        <w:tc>
+          <w:tcPr/>
+          <w:p>
+            <w:pPr>
+              <w:pStyle w:val="Compact"/>
+              <w:jc w:val="left"/>
+            </w:pPr>
+            <w:r>
+              <w:t xml:space="preserve">Fixed (v0.9.1 (Coded CPAT) / v0.9.2)</w:t>
+            </w:r>
+          </w:p>
+        </w:tc>
+        <w:tc>
+          <w:tcPr/>
+          <w:p>
+            <w:pPr>
+              <w:pStyle w:val="Compact"/>
+              <w:jc w:val="left"/>
+            </w:pPr>
+            <w:r>
+              <w:t xml:space="preserve">The defined name VatGen was one fixed cell, the general VAT rate (VAT_WEO) of 2022; every year of the energy-subsidy (vatext) and efficient-price (vat.cost) rows applied it, whatever the year’s rate.</w:t>
+            </w:r>
+          </w:p>
+        </w:tc>
+        <w:tc>
+          <w:tcPr/>
+          <w:p>
+            <w:pPr>
+              <w:pStyle w:val="Compact"/>
+              <w:jc w:val="left"/>
+            </w:pPr>
+            <w:r>
+              <w:t xml:space="preserve">New section-18 row vatgen: VAT_WEO of the year up to LastHistPriceYear, the last historical rate held after it (user assumption 2026-10-29); column D keeps the consumer flag x household share. Egypt unchanged (14% throughout). Legacy: the subsidy block uses the year’s rate (L17787), so the vatext part was introduced in v0.9.0; the efficient-price part is legacy bug L225.</w:t>
+            </w:r>
+          </w:p>
+        </w:tc>
+      </w:tr>
+      <w:tr>
+        <w:tc>
+          <w:tcPr/>
+          <w:p>
+            <w:pPr>
+              <w:pStyle w:val="Compact"/>
+              <w:jc w:val="left"/>
+            </w:pPr>
+            <w:r>
+              <w:t xml:space="preserve">M16</w:t>
+            </w:r>
+          </w:p>
+        </w:tc>
+        <w:tc>
+          <w:tcPr/>
+          <w:p>
+            <w:pPr>
+              <w:pStyle w:val="Compact"/>
+              <w:jc w:val="left"/>
+            </w:pPr>
+            <w:r>
+              <w:t xml:space="preserve">Road: freight BEV feebate valued at the ICEV truck’s distance</w:t>
+            </w:r>
+          </w:p>
+        </w:tc>
+        <w:tc>
+          <w:tcPr/>
+          <w:p>
+            <w:pPr>
+              <w:pStyle w:val="Compact"/>
+              <w:jc w:val="left"/>
+            </w:pPr>
+            <w:r>
+              <w:t xml:space="preserve">Fixed (v0.9.1 (Coded CPAT) / v0.9.2)</w:t>
+            </w:r>
+          </w:p>
+        </w:tc>
+        <w:tc>
+          <w:tcPr/>
+          <w:p>
+            <w:pPr>
+              <w:pStyle w:val="Compact"/>
+              <w:jc w:val="left"/>
+            </w:pPr>
+            <w:r>
+              <w:t xml:space="preserve">trfbvfb.fre.bev multiplied by the ICEV discounted km (trdkmfrei); the passenger and 2-3 wheeler BEV feebates use the BEV distance.</w:t>
+            </w:r>
+          </w:p>
+        </w:tc>
+        <w:tc>
+          <w:tcPr/>
+          <w:p>
+            <w:pPr>
+              <w:pStyle w:val="Compact"/>
+              <w:jc w:val="left"/>
+            </w:pPr>
+            <w:r>
+              <w:t xml:space="preserve">The freight BEV discounted km (trdkmfreb.fre.bev, legacy row 4630). Engineer road model only. In legacy too: L226.</w:t>
+            </w:r>
+          </w:p>
+        </w:tc>
+      </w:tr>
+      <w:tr>
+        <w:tc>
+          <w:tcPr/>
+          <w:p>
+            <w:pPr>
+              <w:pStyle w:val="Compact"/>
+              <w:jc w:val="left"/>
+            </w:pPr>
+            <w:r>
+              <w:t xml:space="preserve">M17</w:t>
+            </w:r>
+          </w:p>
+        </w:tc>
+        <w:tc>
+          <w:tcPr/>
+          <w:p>
+            <w:pPr>
+              <w:pStyle w:val="Compact"/>
+              <w:jc w:val="left"/>
+            </w:pPr>
+            <w:r>
+              <w:t xml:space="preserve">Road: plug-in hybrid cost mixed BEV capital cost with ICEV insurance and maintenance</w:t>
+            </w:r>
+          </w:p>
+        </w:tc>
+        <w:tc>
+          <w:tcPr/>
+          <w:p>
+            <w:pPr>
+              <w:pStyle w:val="Compact"/>
+              <w:jc w:val="left"/>
+            </w:pPr>
+            <w:r>
+              <w:t xml:space="preserve">Fixed (v0.9.1 (Coded CPAT) / v0.9.2)</w:t>
+            </w:r>
+          </w:p>
+        </w:tc>
+        <w:tc>
+          <w:tcPr/>
+          <w:p>
+            <w:pPr>
+              <w:pStyle w:val="Compact"/>
+              <w:jc w:val="left"/>
+            </w:pPr>
+            <w:r>
+              <w:t xml:space="preserve">trtcfp.pas.phv took the BEV depreciation and salvage with the ICEV insurance and maintenance (insurance on the ICEV price).</w:t>
+            </w:r>
+          </w:p>
+        </w:tc>
+        <w:tc>
+          <w:tcPr/>
+          <w:p>
+            <w:pPr>
+              <w:pStyle w:val="Compact"/>
+              <w:jc w:val="left"/>
+            </w:pPr>
+            <w:r>
+              <w:t xml:space="preserve">One price basis (user 2026-10-29; no PHEV price in the data): new row trimphv.pas.phv, insurance on the BEV price with the ICEV maintenance per km and the ICEV distance. Engineer road model only. In legacy too: L227 (with L41, the range anxiety).</w:t>
+            </w:r>
+          </w:p>
+        </w:tc>
+      </w:tr>
+      <w:tr>
+        <w:tc>
+          <w:tcPr/>
+          <w:p>
+            <w:pPr>
+              <w:pStyle w:val="Compact"/>
+              <w:jc w:val="left"/>
+            </w:pPr>
+            <w:r>
+              <w:t xml:space="preserve">M18</w:t>
+            </w:r>
+          </w:p>
+        </w:tc>
+        <w:tc>
+          <w:tcPr/>
+          <w:p>
+            <w:pPr>
+              <w:pStyle w:val="Compact"/>
+              <w:jc w:val="left"/>
+            </w:pPr>
+            <w:r>
+              <w:t xml:space="preserve">Road: bus electricity scaled by the bus energy of every fuel (withdrawn: not a bug)</w:t>
+            </w:r>
+          </w:p>
+        </w:tc>
+        <w:tc>
+          <w:tcPr/>
+          <w:p>
+            <w:pPr>
+              <w:pStyle w:val="Compact"/>
+              <w:jc w:val="left"/>
+            </w:pPr>
+            <w:r>
+              <w:t xml:space="preserve">Withdrawn (not a bug, user 2026-10-29)</w:t>
+            </w:r>
+          </w:p>
+        </w:tc>
+        <w:tc>
+          <w:tcPr/>
+          <w:p>
+            <w:pPr>
+              <w:pStyle w:val="Compact"/>
+              <w:jc w:val="left"/>
+            </w:pPr>
+            <w:r>
+              <w:t xml:space="preserve">Registered in v0.9.1 as a bug (column D = base bus use of diesel, LPG, gas and electricity). Withdrawn by the user (2026-10-29): it is the legacy method (legacy row 5318 sums every bus fuel): bus electricity = all base-year bus energy x the passenger electricity share, which is how buses electrify. The proposed fix (base-year bus electricity only) would keep bus electricity near zero where base-year bus electricity is ~0. Legacy bug L30 (units) stays as it is.</w:t>
+            </w:r>
+          </w:p>
+        </w:tc>
+        <w:tc>
+          <w:tcPr/>
+          <w:p>
+            <w:pPr>
+              <w:pStyle w:val="Compact"/>
+              <w:jc w:val="left"/>
+            </w:pPr>
+            <w:r>
+              <w:t xml:space="preserve">None: kept as legacy.</w:t>
+            </w:r>
+          </w:p>
+        </w:tc>
+      </w:tr>
+      <w:tr>
+        <w:tc>
+          <w:tcPr/>
+          <w:p>
+            <w:pPr>
+              <w:pStyle w:val="Compact"/>
+              <w:jc w:val="left"/>
+            </w:pPr>
+            <w:r>
+              <w:t xml:space="preserve">M19</w:t>
+            </w:r>
+          </w:p>
+        </w:tc>
+        <w:tc>
+          <w:tcPr/>
+          <w:p>
+            <w:pPr>
+              <w:pStyle w:val="Compact"/>
+              <w:jc w:val="left"/>
+            </w:pPr>
+            <w:r>
+              <w:t xml:space="preserve">Nominal GDP divided by a billion although WEO is in billions</w:t>
+            </w:r>
+          </w:p>
+        </w:tc>
+        <w:tc>
+          <w:tcPr/>
+          <w:p>
+            <w:pPr>
+              <w:pStyle w:val="Compact"/>
+              <w:jc w:val="left"/>
+            </w:pPr>
+            <w:r>
+              <w:t xml:space="preserve">Fixed (v0.9.1 (Coded CPAT) / v0.9.2)</w:t>
+            </w:r>
+          </w:p>
+        </w:tc>
+        <w:tc>
+          <w:tcPr/>
+          <w:p>
+            <w:pPr>
+              <w:pStyle w:val="Compact"/>
+              <w:jc w:val="left"/>
+            </w:pPr>
+            <w:r>
+              <w:t xml:space="preserve">gdpn = WEO NGDP / Billion: 1e9 too small (Egypt 7.8e-6 bn LCU). Not in legacy (row 424, no division): introduced in v0.5.6.</w:t>
+            </w:r>
+          </w:p>
+        </w:tc>
+        <w:tc>
+          <w:tcPr/>
+          <w:p>
+            <w:pPr>
+              <w:pStyle w:val="Compact"/>
+              <w:jc w:val="left"/>
+            </w:pPr>
+            <w:r>
+              <w:t xml:space="preserve">No division; unit bn nominal. Output rows only.</w:t>
+            </w:r>
+          </w:p>
+        </w:tc>
+      </w:tr>
+      <w:tr>
+        <w:tc>
+          <w:tcPr/>
+          <w:p>
+            <w:pPr>
+              <w:pStyle w:val="Compact"/>
+              <w:jc w:val="left"/>
+            </w:pPr>
+            <w:r>
+              <w:t xml:space="preserve">M20</w:t>
+            </w:r>
+          </w:p>
+        </w:tc>
+        <w:tc>
+          <w:tcPr/>
+          <w:p>
+            <w:pPr>
+              <w:pStyle w:val="Compact"/>
+              <w:jc w:val="left"/>
+            </w:pPr>
+            <w:r>
+              <w:t xml:space="preserve">International prices: World Bank and IEA LNG and Europe gas series swapped</w:t>
+            </w:r>
+          </w:p>
+        </w:tc>
+        <w:tc>
+          <w:tcPr/>
+          <w:p>
+            <w:pPr>
+              <w:pStyle w:val="Compact"/>
+              <w:jc w:val="left"/>
+            </w:pPr>
+            <w:r>
+              <w:t xml:space="preserve">Fixed (v0.9.1 (Coded CPAT) / v0.9.2)</w:t>
+            </w:r>
+          </w:p>
+        </w:tc>
+        <w:tc>
+          <w:tcPr/>
+          <w:p>
+            <w:pPr>
+              <w:pStyle w:val="Compact"/>
+              <w:jc w:val="left"/>
+            </w:pPr>
+            <w:r>
+              <w:t xml:space="preserve">The WB LNG price read Prices_int row 15 (</w:t>
+            </w:r>
+            <w:r>
+              <w:t xml:space="preserve">“</w:t>
+            </w:r>
+            <w:r>
+              <w:t xml:space="preserve">Natural gas, Europe</w:t>
+            </w:r>
+            <w:r>
+              <w:t xml:space="preserve">”</w:t>
+            </w:r>
+            <w:r>
+              <w:t xml:space="preserve">) and the Europe price row 17 (</w:t>
+            </w:r>
+            <w:r>
+              <w:t xml:space="preserve">“</w:t>
+            </w:r>
+            <w:r>
+              <w:t xml:space="preserve">Liquefied natural gas, Japan</w:t>
+            </w:r>
+            <w:r>
+              <w:t xml:space="preserve">”</w:t>
+            </w:r>
+            <w:r>
+              <w:t xml:space="preserve">); the legacy check found the same swap in the IEA block (rows 39 and 41), which EIA, AVG and IMF-IEA inherit. In legacy too: L228 (WB), L229 (IEA).</w:t>
+            </w:r>
+          </w:p>
+        </w:tc>
+        <w:tc>
+          <w:tcPr/>
+          <w:p>
+            <w:pPr>
+              <w:pStyle w:val="Compact"/>
+              <w:jc w:val="left"/>
+            </w:pPr>
+            <w:r>
+              <w:t xml:space="preserve">Each series read by its label: WB LNG row 17, Europe row 15; IEA LNG row 41, Europe row 39. Egypt unchanged (IMF, global gas).</w:t>
+            </w:r>
+          </w:p>
+        </w:tc>
+      </w:tr>
+      <w:tr>
+        <w:tc>
+          <w:tcPr/>
+          <w:p>
+            <w:pPr>
+              <w:pStyle w:val="Compact"/>
+              <w:jc w:val="left"/>
+            </w:pPr>
+            <w:r>
+              <w:t xml:space="preserve">M21</w:t>
+            </w:r>
+          </w:p>
+        </w:tc>
+        <w:tc>
+          <w:tcPr/>
+          <w:p>
+            <w:pPr>
+              <w:pStyle w:val="Compact"/>
+              <w:jc w:val="left"/>
+            </w:pPr>
+            <w:r>
+              <w:t xml:space="preserve">Methane fee: marginal abatement price #DIV/0 where the curve exponent is 0</w:t>
+            </w:r>
+          </w:p>
+        </w:tc>
+        <w:tc>
+          <w:tcPr/>
+          <w:p>
+            <w:pPr>
+              <w:pStyle w:val="Compact"/>
+              <w:jc w:val="left"/>
+            </w:pPr>
+            <w:r>
+              <w:t xml:space="preserve">Fixed (v0.9.1 (Coded CPAT) / v0.9.2)</w:t>
+            </w:r>
+          </w:p>
+        </w:tc>
+        <w:tc>
+          <w:tcPr/>
+          <w:p>
+            <w:pPr>
+              <w:pStyle w:val="Compact"/>
+              <w:jc w:val="left"/>
+            </w:pPr>
+            <w:r>
+              <w:t xml:space="preserve">mfp = MIN(fee, (1/a)^(1/b)) gave #DIV/0 where b = 0 and a &lt;&gt; 0, and #NUM! where b is about 1e-14 (45 country sources in the data, e.g. AFG coal mining; DMA livestock b = 0). Not in legacy (no cap): introduced in v0.3.17.</w:t>
+            </w:r>
+          </w:p>
+        </w:tc>
+        <w:tc>
+          <w:tcPr/>
+          <w:p>
+            <w:pPr>
+              <w:pStyle w:val="Compact"/>
+              <w:jc w:val="left"/>
+            </w:pPr>
+            <w:r>
+              <w:t xml:space="preserve">IF(OR(b &lt;= 0, LN(1/a)/b &gt; 700), fee, MIN(fee, (1/a)^(1/b))) (MFEEPRICE): the cap is beyond any fee there. Egypt unchanged.</w:t>
+            </w:r>
+          </w:p>
+        </w:tc>
+      </w:tr>
+      <w:tr>
+        <w:tc>
+          <w:tcPr/>
+          <w:p>
+            <w:pPr>
+              <w:pStyle w:val="Compact"/>
+              <w:jc w:val="left"/>
+            </w:pPr>
+            <w:r>
+              <w:t xml:space="preserve">M22</w:t>
+            </w:r>
+          </w:p>
+        </w:tc>
+        <w:tc>
+          <w:tcPr/>
+          <w:p>
+            <w:pPr>
+              <w:pStyle w:val="Compact"/>
+              <w:jc w:val="left"/>
+            </w:pPr>
+            <w:r>
+              <w:t xml:space="preserve">Distribution: percentile recycling rows added a % row to amounts in local currency</w:t>
+            </w:r>
+          </w:p>
+        </w:tc>
+        <w:tc>
+          <w:tcPr/>
+          <w:p>
+            <w:pPr>
+              <w:pStyle w:val="Compact"/>
+              <w:jc w:val="left"/>
+            </w:pPr>
+            <w:r>
+              <w:t xml:space="preserve">Fixed (v0.9.1 (Coded CPAT) / v0.9.2 (Distribution 0.1.4))</w:t>
+            </w:r>
+          </w:p>
+        </w:tc>
+        <w:tc>
+          <w:tcPr/>
+          <w:p>
+            <w:pPr>
+              <w:pStyle w:val="Compact"/>
+              <w:jc w:val="left"/>
+            </w:pPr>
+            <w:r>
+              <w:t xml:space="preserve">hrec = (pit + pui + cts + tgt) / hcpc x 100 read the public-investment row by the key pui.</w:t>
+            </w:r>
+            <w:r>
+              <w:t xml:space="preserve">, which the recycling-gain % row reuses, so it added % of consumption to amounts per person.</w:t>
+            </w:r>
+          </w:p>
+        </w:tc>
+        <w:tc>
+          <w:tcPr/>
+          <w:p>
+            <w:pPr>
+              <w:pStyle w:val="Compact"/>
+              <w:jc w:val="left"/>
+            </w:pPr>
+            <w:r>
+              <w:t xml:space="preserve">hrec reads the public investment amount per person of the sample (LCU). Egypt: the 25th/75th percentile recycling and net rows where public investment is used. Not in legacy (T3194 uses the amount): introduced in v0.6.0 (fixes D18, D19).</w:t>
             </w:r>
           </w:p>
         </w:tc>
@@ -16521,7 +17172,7 @@
         <w:t xml:space="preserve"> </w:t>
       </w:r>
       <w:r>
-        <w:t xml:space="preserve">column says which) the repository holds a cell-level plan (excel_ai/legacy/bugfixes/data, JSON): for each cell the formula now, the new formula, the range to fill and the policy row. Apply a plan as stage F above: type the new formula in the cell, fill the range, copy the baseline cells onto the policy row given (Paste Special, Formulas), recalculate, then run T1-T7. The plans are printed with each bug in Legacy_CPAT_Bugs_v9.0.docx.</w:t>
+        <w:t xml:space="preserve">column says which) the repository holds a cell-level plan (excel_ai/legacy/bugfixes/data, JSON): for each cell the formula now, the new formula, the range to fill and the policy row. Apply a plan as stage F above: type the new formula in the cell, fill the range, copy the baseline cells onto the policy row given (Paste Special, Formulas), recalculate, then run T1-T7. The plans are printed with each bug in Legacy_CPAT_Bugs_v0.9.2.docx.</w:t>
       </w:r>
     </w:p>
     <w:p>

</xml_diff>

<commit_message>
Excel-AI 1.0.0 and Distribution 1.0.0 built; register documents; Coded CPAT references
Mitigation 1.0.0: quick check PASS, output codes against 0.9.2: 15,086 shared, 0 changed.
Distribution 1.0.0: check PASS. Register documents, tracker, codes map, Word documentation
and Formulas.md regenerated for 1.0.0; 0.9.2 / 0.1.4 files to releases/. Coded CPAT
reference values re-extracted from the 1.0.0 workbooks (identical to 0.9.2 / 0.1.4);
64 tests pass.

Co-Authored-By: Claude Opus 5.5 <noreply@anthropic.com>
Claude-Session: https://claude.ai/code/session_01VSHkeG2g7jKJXypZEVGQ8n
</commit_message>
<xml_diff>
--- a/excel_ai/mitigation/CPAT-AI-Mitigation_Documentation.docx
+++ b/excel_ai/mitigation/CPAT-AI-Mitigation_Documentation.docx
@@ -25,7 +25,7 @@
         <w:t xml:space="preserve"> </w:t>
       </w:r>
       <w:r>
-        <w:t xml:space="preserve">v0.9.2</w:t>
+        <w:t xml:space="preserve">v1.0.0</w:t>
       </w:r>
     </w:p>
     <w:p>
@@ -2000,7 +2000,7 @@
         <w:rPr>
           <w:rStyle w:val="VerbatimChar"/>
         </w:rPr>
-        <w:t xml:space="preserve">excel_ai/Tracking_Legacy_Bugs_v0.9.2.xlsx</w:t>
+        <w:t xml:space="preserve">excel_ai/Tracking_Legacy_Bugs_v1.0.0.xlsx</w:t>
       </w:r>
       <w:r>
         <w:t xml:space="preserve"> </w:t>
@@ -2015,7 +2015,7 @@
         <w:rPr>
           <w:rStyle w:val="VerbatimChar"/>
         </w:rPr>
-        <w:t xml:space="preserve">excel_ai/Legacy_CPAT_Bugs_v0.9.2.docx</w:t>
+        <w:t xml:space="preserve">excel_ai/Legacy_CPAT_Bugs_v1.0.0.docx</w:t>
       </w:r>
       <w:r>
         <w:t xml:space="preserve">, the rest in these appendices. Codes renumbered in v0.8.4 give their former code.</w:t>
@@ -16359,7 +16359,7 @@
               <w:jc w:val="left"/>
             </w:pPr>
             <w:r>
-              <w:t xml:space="preserve">IF(OR(b &lt;= 0, LN(1/a)/b &gt; 700), fee, MIN(fee, (1/a)^(1/b))) (MFEEPRICE): the cap is beyond any fee there. Egypt unchanged.</w:t>
+              <w:t xml:space="preserve">IF(a = 0, 0, MIN(fee, IFERROR(a^(-1/b), fee))) (MFEEPRICE): no cap where b = 0 or where the cap overflows (it is beyond any fee there). Egypt unchanged.</w:t>
             </w:r>
           </w:p>
         </w:tc>
@@ -17172,7 +17172,7 @@
         <w:t xml:space="preserve"> </w:t>
       </w:r>
       <w:r>
-        <w:t xml:space="preserve">column says which) the repository holds a cell-level plan (excel_ai/legacy/bugfixes/data, JSON): for each cell the formula now, the new formula, the range to fill and the policy row. Apply a plan as stage F above: type the new formula in the cell, fill the range, copy the baseline cells onto the policy row given (Paste Special, Formulas), recalculate, then run T1-T7. The plans are printed with each bug in Legacy_CPAT_Bugs_v0.9.2.docx.</w:t>
+        <w:t xml:space="preserve">column says which) the repository holds a cell-level plan (excel_ai/legacy/bugfixes/data, JSON): for each cell the formula now, the new formula, the range to fill and the policy row. Apply a plan as stage F above: type the new formula in the cell, fill the range, copy the baseline cells onto the policy row given (Paste Special, Formulas), recalculate, then run T1-T7. The plans are printed with each bug in Legacy_CPAT_Bugs_v1.0.0.docx.</w:t>
       </w:r>
     </w:p>
     <w:p>

</xml_diff>

<commit_message>
Excel-AI 1.0.1: full check (partial) PASS; quick and distribution checks PASS; register documents v1.0.1; CAVEATS, CHANGELOG, TODO
Co-Authored-By: Claude Opus 5.5 <noreply@anthropic.com>
Claude-Session: https://claude.ai/code/session_01VSHkeKHvEpgMbAi9EGXtF1
</commit_message>
<xml_diff>
--- a/excel_ai/mitigation/CPAT-AI-Mitigation_Documentation.docx
+++ b/excel_ai/mitigation/CPAT-AI-Mitigation_Documentation.docx
@@ -25,7 +25,7 @@
         <w:t xml:space="preserve"> </w:t>
       </w:r>
       <w:r>
-        <w:t xml:space="preserve">v1.0.0</w:t>
+        <w:t xml:space="preserve">v1.0.1</w:t>
       </w:r>
     </w:p>
     <w:p>
@@ -2000,7 +2000,7 @@
         <w:rPr>
           <w:rStyle w:val="VerbatimChar"/>
         </w:rPr>
-        <w:t xml:space="preserve">excel_ai/Tracking_Legacy_Bugs_v1.0.0.xlsx</w:t>
+        <w:t xml:space="preserve">excel_ai/Tracking_Legacy_Bugs_v1.0.1.xlsx</w:t>
       </w:r>
       <w:r>
         <w:t xml:space="preserve"> </w:t>
@@ -2015,7 +2015,7 @@
         <w:rPr>
           <w:rStyle w:val="VerbatimChar"/>
         </w:rPr>
-        <w:t xml:space="preserve">excel_ai/Legacy_CPAT_Bugs_v1.0.0.docx</w:t>
+        <w:t xml:space="preserve">excel_ai/Legacy_CPAT_Bugs_v1.0.1.docx</w:t>
       </w:r>
       <w:r>
         <w:t xml:space="preserve">, the rest in these appendices. Codes renumbered in v0.8.4 give their former code.</w:t>
@@ -17172,7 +17172,7 @@
         <w:t xml:space="preserve"> </w:t>
       </w:r>
       <w:r>
-        <w:t xml:space="preserve">column says which) the repository holds a cell-level plan (excel_ai/legacy/bugfixes/data, JSON): for each cell the formula now, the new formula, the range to fill and the policy row. Apply a plan as stage F above: type the new formula in the cell, fill the range, copy the baseline cells onto the policy row given (Paste Special, Formulas), recalculate, then run T1-T7. The plans are printed with each bug in Legacy_CPAT_Bugs_v1.0.0.docx.</w:t>
+        <w:t xml:space="preserve">column says which) the repository holds a cell-level plan (excel_ai/legacy/bugfixes/data, JSON): for each cell the formula now, the new formula, the range to fill and the policy row. Apply a plan as stage F above: type the new formula in the cell, fill the range, copy the baseline cells onto the policy row given (Paste Special, Formulas), recalculate, then run T1-T7. The plans are printed with each bug in Legacy_CPAT_Bugs_v1.0.1.docx.</w:t>
       </w:r>
     </w:p>
     <w:p>

</xml_diff>

<commit_message>
Legacy bug plans: v0.9.0 plans written out, L131 effect, new bug L230
- tools/gen_G.py rewrites 33 v0.9.0 plans cell by cell from the 465 file
  (118 entries); only L224, a change of method, stays described.
- L230 registered with its plan: the electricity current carbon tax and
  ETS outputs (results 16236-16251) never see the existing carbon price.
- Register text: L131 value effect (results 17161/17163), L129/L132/L133
  locations. Shared 465 reader in tools/xlsb465.py.
- Regenerated in place: BUGS.md, tracker, bugs document, register JSON,
  Documentation, Methods; counts 227 -> 228 patched in the deck, website
  page and QuickStart.

Co-Authored-By: Claude Opus 5.5 <noreply@anthropic.com>
Claude-Session: https://claude.ai/code/session_01VSHkeKLNKwtFiko3pymStx
</commit_message>
<xml_diff>
--- a/excel_ai/mitigation/CPAT-AI-Mitigation_Documentation.docx
+++ b/excel_ai/mitigation/CPAT-AI-Mitigation_Documentation.docx
@@ -2121,7 +2121,7 @@
               <w:jc w:val="left"/>
             </w:pPr>
             <w:r>
-              <w:t xml:space="preserve">227</w:t>
+              <w:t xml:space="preserve">228</w:t>
             </w:r>
           </w:p>
         </w:tc>
@@ -17154,7 +17154,7 @@
         <w:pStyle w:val="FirstParagraph"/>
       </w:pPr>
       <w:r>
-        <w:t xml:space="preserve">For almost every bug (the</w:t>
+        <w:t xml:space="preserve">For every bug (the</w:t>
       </w:r>
       <w:r>
         <w:t xml:space="preserve"> </w:t>

</xml_diff>

<commit_message>
Release 1.0.2: Excel-AI and Distribution 1.0.2 built and checked (quick, distribution, full partial PASS); Coded CPAT 1.0.2p1.1 (65 tests pass)
Co-Authored-By: Claude Opus 5.5 <noreply@anthropic.com>
Claude-Session: https://claude.ai/code/session_01VSHkeKHvEpgMbAi9EGXtF1
</commit_message>
<xml_diff>
--- a/excel_ai/mitigation/CPAT-AI-Mitigation_Documentation.docx
+++ b/excel_ai/mitigation/CPAT-AI-Mitigation_Documentation.docx
@@ -25,7 +25,7 @@
         <w:t xml:space="preserve"> </w:t>
       </w:r>
       <w:r>
-        <w:t xml:space="preserve">v1.0.1</w:t>
+        <w:t xml:space="preserve">v1.0.2</w:t>
       </w:r>
     </w:p>
     <w:p>
@@ -2000,7 +2000,7 @@
         <w:rPr>
           <w:rStyle w:val="VerbatimChar"/>
         </w:rPr>
-        <w:t xml:space="preserve">excel_ai/Tracking_Legacy_Bugs_v1.0.1.xlsx</w:t>
+        <w:t xml:space="preserve">excel_ai/Tracking_Legacy_Bugs_v1.0.2.xlsx</w:t>
       </w:r>
       <w:r>
         <w:t xml:space="preserve"> </w:t>
@@ -2015,7 +2015,7 @@
         <w:rPr>
           <w:rStyle w:val="VerbatimChar"/>
         </w:rPr>
-        <w:t xml:space="preserve">excel_ai/Legacy_CPAT_Bugs_v1.0.1.docx</w:t>
+        <w:t xml:space="preserve">excel_ai/Legacy_CPAT_Bugs_v1.0.2.docx</w:t>
       </w:r>
       <w:r>
         <w:t xml:space="preserve">, the rest in these appendices. Codes renumbered in v0.8.4 give their former code.</w:t>
@@ -2449,7 +2449,7 @@
               <w:jc w:val="left"/>
             </w:pPr>
             <w:r>
-              <w:t xml:space="preserve">9</w:t>
+              <w:t xml:space="preserve">14</w:t>
             </w:r>
           </w:p>
         </w:tc>
@@ -9945,7 +9945,7 @@
         <w:t xml:space="preserve"> </w:t>
       </w:r>
       <w:r>
-        <w:t xml:space="preserve">Not built: deferred by the user (2026-10-29; legacy work in progress).</w:t>
+        <w:t xml:space="preserve">Out of scope (user 2026-10-29): not built; an upgrade (U15-U17).</w:t>
       </w:r>
       <w:r>
         <w:t xml:space="preserve"> </w:t>
@@ -9961,7 +9961,7 @@
         <w:t xml:space="preserve"> </w:t>
       </w:r>
       <w:r>
-        <w:t xml:space="preserve">Not built: R4, R5, R12 deferred by the user (2026-10-29); replicate when built (Replicated; link to revenue, GHG and ETS totals by decision D-R4.)</w:t>
+        <w:t xml:space="preserve">Out of scope (user 2026-10-29): CBAM process emissions (U15) is an upgrade, not built; replicate if it is ever built (Replicated; link to revenue, GHG and ETS totals by decision D-R4.)</w:t>
       </w:r>
       <w:r>
         <w:t xml:space="preserve"> </w:t>
@@ -9977,7 +9977,7 @@
         <w:t xml:space="preserve"> </w:t>
       </w:r>
       <w:r>
-        <w:t xml:space="preserve">Open.</w:t>
+        <w:t xml:space="preserve">Dropped.</w:t>
       </w:r>
     </w:p>
     <w:p>
@@ -10012,7 +10012,7 @@
         <w:t xml:space="preserve"> </w:t>
       </w:r>
       <w:r>
-        <w:t xml:space="preserve">In the prototype:* Not built: deferred by the user (2026-10-29; legacy work in progress).</w:t>
+        <w:t xml:space="preserve">In the prototype:* Out of scope (user 2026-10-29): not built; an upgrade (U15-U17).</w:t>
       </w:r>
       <w:r>
         <w:t xml:space="preserve"> </w:t>
@@ -10028,7 +10028,7 @@
         <w:t xml:space="preserve"> </w:t>
       </w:r>
       <w:r>
-        <w:t xml:space="preserve">Not built: R4, R5, R12 deferred by the user (2026-10-29); replicate when built (Replicated (Equations_addendum R5.10).)</w:t>
+        <w:t xml:space="preserve">Out of scope (user 2026-10-29): green public investment (U16) is an upgrade, not built; replicate if it is ever built (Replicated (Equations_addendum R5.10).)</w:t>
       </w:r>
       <w:r>
         <w:t xml:space="preserve"> </w:t>
@@ -10044,7 +10044,7 @@
         <w:t xml:space="preserve"> </w:t>
       </w:r>
       <w:r>
-        <w:t xml:space="preserve">Open.</w:t>
+        <w:t xml:space="preserve">Dropped.</w:t>
       </w:r>
     </w:p>
     <w:p>
@@ -10078,7 +10078,7 @@
         <w:t xml:space="preserve"> </w:t>
       </w:r>
       <w:r>
-        <w:t xml:space="preserve">Not built: deferred by the user (2026-10-29; legacy work in progress).</w:t>
+        <w:t xml:space="preserve">Out of scope (user 2026-10-29): not built; an upgrade (U15-U17).</w:t>
       </w:r>
       <w:r>
         <w:t xml:space="preserve"> </w:t>
@@ -10094,7 +10094,7 @@
         <w:t xml:space="preserve"> </w:t>
       </w:r>
       <w:r>
-        <w:t xml:space="preserve">Not built: R4, R5, R12 deferred by the user (2026-10-29); replicate when built (Replicated: 2041 blank (Equations_addendum R5).)</w:t>
+        <w:t xml:space="preserve">Out of scope (user 2026-10-29): green public investment (U16) is an upgrade, not built; replicate if it is ever built (Replicated: 2041 blank (Equations_addendum R5).)</w:t>
       </w:r>
       <w:r>
         <w:t xml:space="preserve"> </w:t>
@@ -10110,7 +10110,7 @@
         <w:t xml:space="preserve"> </w:t>
       </w:r>
       <w:r>
-        <w:t xml:space="preserve">Open.</w:t>
+        <w:t xml:space="preserve">Dropped.</w:t>
       </w:r>
     </w:p>
     <w:p>
@@ -10144,7 +10144,7 @@
         <w:t xml:space="preserve"> </w:t>
       </w:r>
       <w:r>
-        <w:t xml:space="preserve">Not built: deferred by the user (2026-10-29; legacy work in progress).</w:t>
+        <w:t xml:space="preserve">Out of scope (user 2026-10-29): not built; an upgrade (U15-U17).</w:t>
       </w:r>
       <w:r>
         <w:t xml:space="preserve"> </w:t>
@@ -10160,7 +10160,7 @@
         <w:t xml:space="preserve"> </w:t>
       </w:r>
       <w:r>
-        <w:t xml:space="preserve">Not built: R4, R5, R12 deferred by the user (2026-10-29); replicate when built (Replicated; constants on Settings labelled legacy hard-coded.)</w:t>
+        <w:t xml:space="preserve">Out of scope (user 2026-10-29): green public investment (U16) is an upgrade, not built; replicate if it is ever built (Replicated; constants on Settings labelled legacy hard-coded.)</w:t>
       </w:r>
       <w:r>
         <w:t xml:space="preserve"> </w:t>
@@ -10176,7 +10176,7 @@
         <w:t xml:space="preserve"> </w:t>
       </w:r>
       <w:r>
-        <w:t xml:space="preserve">Open.</w:t>
+        <w:t xml:space="preserve">Dropped.</w:t>
       </w:r>
     </w:p>
     <w:p>
@@ -10210,7 +10210,7 @@
         <w:t xml:space="preserve"> </w:t>
       </w:r>
       <w:r>
-        <w:t xml:space="preserve">Not built: deferred by the user (2026-10-29; legacy work in progress).</w:t>
+        <w:t xml:space="preserve">Out of scope (user 2026-10-29): not built; an upgrade (U15-U17).</w:t>
       </w:r>
       <w:r>
         <w:t xml:space="preserve"> </w:t>
@@ -10226,7 +10226,7 @@
         <w:t xml:space="preserve"> </w:t>
       </w:r>
       <w:r>
-        <w:t xml:space="preserve">Not built: R4, R5, R12 deferred by the user (2026-10-29); replicate when built (Replicated (#N/A outside the CCDR list); IFERROR would be a departure.)</w:t>
+        <w:t xml:space="preserve">Out of scope (user 2026-10-29): green public investment (U16) is an upgrade, not built; replicate if it is ever built (Replicated (#N/A outside the CCDR list); IFERROR would be a departure.)</w:t>
       </w:r>
       <w:r>
         <w:t xml:space="preserve"> </w:t>
@@ -10242,7 +10242,7 @@
         <w:t xml:space="preserve"> </w:t>
       </w:r>
       <w:r>
-        <w:t xml:space="preserve">Open.</w:t>
+        <w:t xml:space="preserve">Dropped.</w:t>
       </w:r>
     </w:p>
     <w:p>
@@ -10276,7 +10276,7 @@
         <w:t xml:space="preserve"> </w:t>
       </w:r>
       <w:r>
-        <w:t xml:space="preserve">Not built: deferred by the user (2026-10-29; legacy work in progress).</w:t>
+        <w:t xml:space="preserve">Out of scope (user 2026-10-29): not built; an upgrade (U15-U17).</w:t>
       </w:r>
       <w:r>
         <w:t xml:space="preserve"> </w:t>
@@ -10292,7 +10292,7 @@
         <w:t xml:space="preserve"> </w:t>
       </w:r>
       <w:r>
-        <w:t xml:space="preserve">Not built: R4, R5, R12 deferred by the user (2026-10-29); replicate when built (Replicated (Equations_addendum R5.18).)</w:t>
+        <w:t xml:space="preserve">Out of scope (user 2026-10-29): green public investment (U16) is an upgrade, not built; replicate if it is ever built (Replicated (Equations_addendum R5.18).)</w:t>
       </w:r>
       <w:r>
         <w:t xml:space="preserve"> </w:t>
@@ -10308,7 +10308,7 @@
         <w:t xml:space="preserve"> </w:t>
       </w:r>
       <w:r>
-        <w:t xml:space="preserve">Open.</w:t>
+        <w:t xml:space="preserve">Dropped.</w:t>
       </w:r>
     </w:p>
     <w:p>
@@ -10474,7 +10474,7 @@
         <w:t xml:space="preserve"> </w:t>
       </w:r>
       <w:r>
-        <w:t xml:space="preserve">Not built: deferred by the user (2026-10-29; legacy work in progress).</w:t>
+        <w:t xml:space="preserve">Out of scope (user 2026-10-29): not built; an upgrade (U15-U17).</w:t>
       </w:r>
       <w:r>
         <w:t xml:space="preserve"> </w:t>
@@ -10490,7 +10490,7 @@
         <w:t xml:space="preserve"> </w:t>
       </w:r>
       <w:r>
-        <w:t xml:space="preserve">Not built: R4, R5, R12 deferred by the user (2026-10-29); replicate when built (Replicated (Equations_addendum R12.7).)</w:t>
+        <w:t xml:space="preserve">Out of scope (user 2026-10-29): emissions intensity of industrial output (U17) is an upgrade, not built; replicate if it is ever built (Replicated (Equations_addendum R12.7).)</w:t>
       </w:r>
       <w:r>
         <w:t xml:space="preserve"> </w:t>
@@ -10506,7 +10506,7 @@
         <w:t xml:space="preserve"> </w:t>
       </w:r>
       <w:r>
-        <w:t xml:space="preserve">Open.</w:t>
+        <w:t xml:space="preserve">Dropped.</w:t>
       </w:r>
     </w:p>
     <w:p>
@@ -10600,7 +10600,7 @@
         <w:t xml:space="preserve"> </w:t>
       </w:r>
       <w:r>
-        <w:t xml:space="preserve">Not built: deferred by the user (2026-10-29; legacy work in progress).</w:t>
+        <w:t xml:space="preserve">Out of scope (user 2026-10-29): not built; an upgrade (U15-U17).</w:t>
       </w:r>
       <w:r>
         <w:t xml:space="preserve"> </w:t>
@@ -10616,7 +10616,7 @@
         <w:t xml:space="preserve"> </w:t>
       </w:r>
       <w:r>
-        <w:t xml:space="preserve">Not built: R4, R5, R12 deferred by the user (2026-10-29); replicate when built (Replicated (typed GVA, Equations_addendum R12.1).)</w:t>
+        <w:t xml:space="preserve">Out of scope (user 2026-10-29): emissions intensity of industrial output (U17) is an upgrade, not built; replicate if it is ever built (Replicated (typed GVA, Equations_addendum R12.1).)</w:t>
       </w:r>
       <w:r>
         <w:t xml:space="preserve"> </w:t>
@@ -10632,7 +10632,7 @@
         <w:t xml:space="preserve"> </w:t>
       </w:r>
       <w:r>
-        <w:t xml:space="preserve">Open.</w:t>
+        <w:t xml:space="preserve">Dropped.</w:t>
       </w:r>
     </w:p>
     <w:p>
@@ -10666,7 +10666,7 @@
         <w:t xml:space="preserve"> </w:t>
       </w:r>
       <w:r>
-        <w:t xml:space="preserve">Not built: deferred by the user (2026-10-29; legacy work in progress).</w:t>
+        <w:t xml:space="preserve">Out of scope (user 2026-10-29): not built; an upgrade (U15-U17).</w:t>
       </w:r>
       <w:r>
         <w:t xml:space="preserve"> </w:t>
@@ -10682,7 +10682,7 @@
         <w:t xml:space="preserve"> </w:t>
       </w:r>
       <w:r>
-        <w:t xml:space="preserve">Not built: R4, R5, R12 deferred by the user (2026-10-29); replicate when built (Replicated (Equations_addendum R12.9).)</w:t>
+        <w:t xml:space="preserve">Out of scope (user 2026-10-29): emissions intensity of industrial output (U17) is an upgrade, not built; replicate if it is ever built (Replicated (Equations_addendum R12.9).)</w:t>
       </w:r>
       <w:r>
         <w:t xml:space="preserve"> </w:t>
@@ -10698,7 +10698,7 @@
         <w:t xml:space="preserve"> </w:t>
       </w:r>
       <w:r>
-        <w:t xml:space="preserve">Open.</w:t>
+        <w:t xml:space="preserve">Dropped.</w:t>
       </w:r>
     </w:p>
     <w:p>
@@ -10732,7 +10732,7 @@
         <w:t xml:space="preserve"> </w:t>
       </w:r>
       <w:r>
-        <w:t xml:space="preserve">Not built: deferred by the user (2026-10-29; legacy work in progress).</w:t>
+        <w:t xml:space="preserve">Out of scope (user 2026-10-29): not built; an upgrade (U15-U17).</w:t>
       </w:r>
       <w:r>
         <w:t xml:space="preserve"> </w:t>
@@ -10748,7 +10748,7 @@
         <w:t xml:space="preserve"> </w:t>
       </w:r>
       <w:r>
-        <w:t xml:space="preserve">Not built: R4, R5, R12 deferred by the user (2026-10-29); replicate when built (Replicated (typed GVA).)</w:t>
+        <w:t xml:space="preserve">Out of scope (user 2026-10-29): emissions intensity of industrial output (U17) is an upgrade, not built; replicate if it is ever built (Replicated (typed GVA).)</w:t>
       </w:r>
       <w:r>
         <w:t xml:space="preserve"> </w:t>
@@ -10764,7 +10764,7 @@
         <w:t xml:space="preserve"> </w:t>
       </w:r>
       <w:r>
-        <w:t xml:space="preserve">Open.</w:t>
+        <w:t xml:space="preserve">Dropped.</w:t>
       </w:r>
     </w:p>
     <w:p>
@@ -14850,6 +14850,262 @@
           </w:p>
         </w:tc>
       </w:tr>
+      <w:tr>
+        <w:tc>
+          <w:tcPr/>
+          <w:p>
+            <w:pPr>
+              <w:pStyle w:val="Compact"/>
+              <w:jc w:val="left"/>
+            </w:pPr>
+            <w:r>
+              <w:t xml:space="preserve">U15</w:t>
+            </w:r>
+          </w:p>
+        </w:tc>
+        <w:tc>
+          <w:tcPr/>
+          <w:p>
+            <w:pPr>
+              <w:pStyle w:val="Compact"/>
+              <w:jc w:val="left"/>
+            </w:pPr>
+            <w:r>
+              <w:t xml:space="preserve">Low</w:t>
+            </w:r>
+          </w:p>
+        </w:tc>
+        <w:tc>
+          <w:tcPr/>
+          <w:p>
+            <w:pPr>
+              <w:pStyle w:val="Compact"/>
+              <w:jc w:val="left"/>
+            </w:pPr>
+            <w:r>
+              <w:t xml:space="preserve">CBAM process emissions (legacy R4)</w:t>
+            </w:r>
+          </w:p>
+        </w:tc>
+        <w:tc>
+          <w:tcPr/>
+          <w:p>
+            <w:pPr>
+              <w:pStyle w:val="Compact"/>
+              <w:jc w:val="left"/>
+            </w:pPr>
+            <w:r>
+              <w:t xml:space="preserve">Out of scope (user 2026-10-29). Design: section 17b sub-block; switches CBAMProc</w:t>
+            </w:r>
+            <w:r>
+              <w:t xml:space="preserve"> </w:t>
+            </w:r>
+            <w:r>
+              <w:t xml:space="preserve">per scenario (ScenarioDefinition 117-121); production, growth and product prices typed EGY in Constants; EFs and semi-elasticities from Manual inputs H30:K37, E40:E47; fuel price per tCO2 = ctr + etr (section 1), process price = switch x fuel price; memo rows (legacy reads none). Bugs L197-L213, L216-L219 (part), issue I123.</w:t>
+            </w:r>
+          </w:p>
+        </w:tc>
+      </w:tr>
+      <w:tr>
+        <w:tc>
+          <w:tcPr/>
+          <w:p>
+            <w:pPr>
+              <w:pStyle w:val="Compact"/>
+              <w:jc w:val="left"/>
+            </w:pPr>
+            <w:r>
+              <w:t xml:space="preserve">U16</w:t>
+            </w:r>
+          </w:p>
+        </w:tc>
+        <w:tc>
+          <w:tcPr/>
+          <w:p>
+            <w:pPr>
+              <w:pStyle w:val="Compact"/>
+              <w:jc w:val="left"/>
+            </w:pPr>
+            <w:r>
+              <w:t xml:space="preserve">Low</w:t>
+            </w:r>
+          </w:p>
+        </w:tc>
+        <w:tc>
+          <w:tcPr/>
+          <w:p>
+            <w:pPr>
+              <w:pStyle w:val="Compact"/>
+              <w:jc w:val="left"/>
+            </w:pPr>
+            <w:r>
+              <w:t xml:space="preserve">Green public investment (legacy R5)</w:t>
+            </w:r>
+          </w:p>
+        </w:tc>
+        <w:tc>
+          <w:tcPr/>
+          <w:p>
+            <w:pPr>
+              <w:pStyle w:val="Compact"/>
+              <w:jc w:val="left"/>
+            </w:pPr>
+            <w:r>
+              <w:t xml:space="preserve">Out of scope (user 2026-10-29). Design: section 16c; constants GreenInvStart 2026, GreenShare 0.5, NetZeroStart 2026, NetZeroEnd 2060, PublicInvPart 0.5, GreenNeedYrs 35; CCDR ratio from ETS+LTS A261:A302 / H261:H302; phi = 1-(t-T0+1)/(T1-T0). Issues I124-I128.</w:t>
+            </w:r>
+          </w:p>
+        </w:tc>
+      </w:tr>
+      <w:tr>
+        <w:tc>
+          <w:tcPr/>
+          <w:p>
+            <w:pPr>
+              <w:pStyle w:val="Compact"/>
+              <w:jc w:val="left"/>
+            </w:pPr>
+            <w:r>
+              <w:t xml:space="preserve">U17</w:t>
+            </w:r>
+          </w:p>
+        </w:tc>
+        <w:tc>
+          <w:tcPr/>
+          <w:p>
+            <w:pPr>
+              <w:pStyle w:val="Compact"/>
+              <w:jc w:val="left"/>
+            </w:pPr>
+            <w:r>
+              <w:t xml:space="preserve">Low</w:t>
+            </w:r>
+          </w:p>
+        </w:tc>
+        <w:tc>
+          <w:tcPr/>
+          <w:p>
+            <w:pPr>
+              <w:pStyle w:val="Compact"/>
+              <w:jc w:val="left"/>
+            </w:pPr>
+            <w:r>
+              <w:t xml:space="preserve">Emissions intensity of industrial output (legacy R12)</w:t>
+            </w:r>
+          </w:p>
+        </w:tc>
+        <w:tc>
+          <w:tcPr/>
+          <w:p>
+            <w:pPr>
+              <w:pStyle w:val="Compact"/>
+              <w:jc w:val="left"/>
+            </w:pPr>
+            <w:r>
+              <w:t xml:space="preserve">Out of scope (user 2026-10-29). Design: block 13b; GVA typed EGY in Constants; manufacturing electricity = demtot x (sh_tsd + sh_eou) (legacy row 10071); variable co2.idr. Issues I131-I134.</w:t>
+            </w:r>
+          </w:p>
+        </w:tc>
+      </w:tr>
+      <w:tr>
+        <w:tc>
+          <w:tcPr/>
+          <w:p>
+            <w:pPr>
+              <w:pStyle w:val="Compact"/>
+              <w:jc w:val="left"/>
+            </w:pPr>
+            <w:r>
+              <w:t xml:space="preserve">U18</w:t>
+            </w:r>
+          </w:p>
+        </w:tc>
+        <w:tc>
+          <w:tcPr/>
+          <w:p>
+            <w:pPr>
+              <w:pStyle w:val="Compact"/>
+              <w:jc w:val="left"/>
+            </w:pPr>
+            <w:r>
+              <w:t xml:space="preserve">Low</w:t>
+            </w:r>
+          </w:p>
+        </w:tc>
+        <w:tc>
+          <w:tcPr/>
+          <w:p>
+            <w:pPr>
+              <w:pStyle w:val="Compact"/>
+              <w:jc w:val="left"/>
+            </w:pPr>
+            <w:r>
+              <w:t xml:space="preserve">Air pollution module (standalone)</w:t>
+            </w:r>
+          </w:p>
+        </w:tc>
+        <w:tc>
+          <w:tcPr/>
+          <w:p>
+            <w:pPr>
+              <w:pStyle w:val="Compact"/>
+              <w:jc w:val="left"/>
+            </w:pPr>
+            <w:r>
+              <w:t xml:space="preserve">Out of scope (user 2026-10-29). Mitigation keeps the legacy 465 values of tab FromAirPollution (Egypt; other countries 0, I106) for the Pigouvian air-pollution cost and the air-pollution welfare; the scaffold excel_ai/air_pollution/ stays as it is.</w:t>
+            </w:r>
+          </w:p>
+        </w:tc>
+      </w:tr>
+      <w:tr>
+        <w:tc>
+          <w:tcPr/>
+          <w:p>
+            <w:pPr>
+              <w:pStyle w:val="Compact"/>
+              <w:jc w:val="left"/>
+            </w:pPr>
+            <w:r>
+              <w:t xml:space="preserve">U19</w:t>
+            </w:r>
+          </w:p>
+        </w:tc>
+        <w:tc>
+          <w:tcPr/>
+          <w:p>
+            <w:pPr>
+              <w:pStyle w:val="Compact"/>
+              <w:jc w:val="left"/>
+            </w:pPr>
+            <w:r>
+              <w:t xml:space="preserve">Low</w:t>
+            </w:r>
+          </w:p>
+        </w:tc>
+        <w:tc>
+          <w:tcPr/>
+          <w:p>
+            <w:pPr>
+              <w:pStyle w:val="Compact"/>
+              <w:jc w:val="left"/>
+            </w:pPr>
+            <w:r>
+              <w:t xml:space="preserve">Transport co-benefits module (standalone)</w:t>
+            </w:r>
+          </w:p>
+        </w:tc>
+        <w:tc>
+          <w:tcPr/>
+          <w:p>
+            <w:pPr>
+              <w:pStyle w:val="Compact"/>
+              <w:jc w:val="left"/>
+            </w:pPr>
+            <w:r>
+              <w:t xml:space="preserve">Out of scope (user 2026-10-29). Mitigation keeps the legacy 465 values of tab FromTransportCB (Egypt; other countries 0, I106) for the Pigouvian road-transport cost and the road welfare; section 5b stays as the block the module would read.</w:t>
+            </w:r>
+          </w:p>
+        </w:tc>
+      </w:tr>
     </w:tbl>
     <w:bookmarkEnd w:id="38"/>
     <w:bookmarkStart w:id="39" w:name="appendix-f.-prototype-bugs-m"/>
@@ -17172,7 +17428,7 @@
         <w:t xml:space="preserve"> </w:t>
       </w:r>
       <w:r>
-        <w:t xml:space="preserve">column says which) the repository holds a cell-level plan (excel_ai/legacy/bugfixes/data, JSON): for each cell the formula now, the new formula, the range to fill and the policy row. Apply a plan as stage F above: type the new formula in the cell, fill the range, copy the baseline cells onto the policy row given (Paste Special, Formulas), recalculate, then run T1-T7. The plans are printed with each bug in Legacy_CPAT_Bugs_v1.0.1.docx.</w:t>
+        <w:t xml:space="preserve">column says which) the repository holds a cell-level plan (excel_ai/legacy/bugfixes/data, JSON): for each cell the formula now, the new formula, the range to fill and the policy row. Apply a plan as stage F above: type the new formula in the cell, fill the range, copy the baseline cells onto the policy row given (Paste Special, Formulas), recalculate, then run T1-T7. The plans are printed with each bug in Legacy_CPAT_Bugs_v1.0.2.docx.</w:t>
       </w:r>
     </w:p>
     <w:p>

</xml_diff>

<commit_message>
Release 1.0.3: built and checked (quick, distribution, full partial PASS); Coded CPAT 1.0.3p1.1 (65 tests pass)
Co-Authored-By: Claude Opus 5.5 <noreply@anthropic.com>
Claude-Session: https://claude.ai/code/session_01VSHkeKHvEpgMbAi9EGXtF1
</commit_message>
<xml_diff>
--- a/excel_ai/mitigation/CPAT-AI-Mitigation_Documentation.docx
+++ b/excel_ai/mitigation/CPAT-AI-Mitigation_Documentation.docx
@@ -25,7 +25,7 @@
         <w:t xml:space="preserve"> </w:t>
       </w:r>
       <w:r>
-        <w:t xml:space="preserve">v1.0.2</w:t>
+        <w:t xml:space="preserve">v1.0.3</w:t>
       </w:r>
     </w:p>
     <w:p>
@@ -2000,7 +2000,7 @@
         <w:rPr>
           <w:rStyle w:val="VerbatimChar"/>
         </w:rPr>
-        <w:t xml:space="preserve">excel_ai/Tracking_Legacy_Bugs_v1.0.2.xlsx</w:t>
+        <w:t xml:space="preserve">excel_ai/Tracking_Legacy_Bugs_v1.0.3.xlsx</w:t>
       </w:r>
       <w:r>
         <w:t xml:space="preserve"> </w:t>
@@ -2015,7 +2015,7 @@
         <w:rPr>
           <w:rStyle w:val="VerbatimChar"/>
         </w:rPr>
-        <w:t xml:space="preserve">excel_ai/Legacy_CPAT_Bugs_v1.0.2.docx</w:t>
+        <w:t xml:space="preserve">excel_ai/Legacy_CPAT_Bugs_v1.0.3.docx</w:t>
       </w:r>
       <w:r>
         <w:t xml:space="preserve">, the rest in these appendices. Codes renumbered in v0.8.4 give their former code.</w:t>
@@ -17428,7 +17428,7 @@
         <w:t xml:space="preserve"> </w:t>
       </w:r>
       <w:r>
-        <w:t xml:space="preserve">column says which) the repository holds a cell-level plan (excel_ai/legacy/bugfixes/data, JSON): for each cell the formula now, the new formula, the range to fill and the policy row. Apply a plan as stage F above: type the new formula in the cell, fill the range, copy the baseline cells onto the policy row given (Paste Special, Formulas), recalculate, then run T1-T7. The plans are printed with each bug in Legacy_CPAT_Bugs_v1.0.2.docx.</w:t>
+        <w:t xml:space="preserve">column says which) the repository holds a cell-level plan (excel_ai/legacy/bugfixes/data, JSON): for each cell the formula now, the new formula, the range to fill and the policy row. Apply a plan as stage F above: type the new formula in the cell, fill the range, copy the baseline cells onto the policy row given (Paste Special, Formulas), recalculate, then run T1-T7. The plans are printed with each bug in Legacy_CPAT_Bugs_v1.0.3.docx.</w:t>
       </w:r>
     </w:p>
     <w:p>

</xml_diff>

<commit_message>
1.0.4: stored results keep the Mitigation rows (Distribution is blank in the batch copies); VBA lint knows Collection; stored test skips text cells
Co-Authored-By: Claude Opus 5.5 <noreply@anthropic.com>
Claude-Session: https://claude.ai/code/session_01VSHkeKHvEpgMbAi9EGXtF1
</commit_message>
<xml_diff>
--- a/excel_ai/mitigation/CPAT-AI-Mitigation_Documentation.docx
+++ b/excel_ai/mitigation/CPAT-AI-Mitigation_Documentation.docx
@@ -25,7 +25,7 @@
         <w:t xml:space="preserve"> </w:t>
       </w:r>
       <w:r>
-        <w:t xml:space="preserve">v1.0.3</w:t>
+        <w:t xml:space="preserve">v1.0.4</w:t>
       </w:r>
     </w:p>
     <w:p>
@@ -608,7 +608,7 @@
         <w:rPr>
           <w:rStyle w:val="VerbatimChar"/>
         </w:rPr>
-        <w:t xml:space="preserve">LiveOutputs</w:t>
+        <w:t xml:space="preserve">MTOutputs</w:t>
       </w:r>
       <w:r>
         <w:t xml:space="preserve">,</w:t>
@@ -1716,7 +1716,7 @@
           <w:bCs/>
           <w:b/>
         </w:rPr>
-        <w:t xml:space="preserve">LiveOutputs</w:t>
+        <w:t xml:space="preserve">MTOutputs</w:t>
       </w:r>
       <w:r>
         <w:t xml:space="preserve"> </w:t>
@@ -2000,7 +2000,7 @@
         <w:rPr>
           <w:rStyle w:val="VerbatimChar"/>
         </w:rPr>
-        <w:t xml:space="preserve">excel_ai/Tracking_Legacy_Bugs_v1.0.3.xlsx</w:t>
+        <w:t xml:space="preserve">excel_ai/Tracking_Legacy_Bugs_v1.0.4.xlsx</w:t>
       </w:r>
       <w:r>
         <w:t xml:space="preserve"> </w:t>
@@ -2015,7 +2015,7 @@
         <w:rPr>
           <w:rStyle w:val="VerbatimChar"/>
         </w:rPr>
-        <w:t xml:space="preserve">excel_ai/Legacy_CPAT_Bugs_v1.0.3.docx</w:t>
+        <w:t xml:space="preserve">excel_ai/Legacy_CPAT_Bugs_v1.0.4.docx</w:t>
       </w:r>
       <w:r>
         <w:t xml:space="preserve">, the rest in these appendices. Codes renumbered in v0.8.4 give their former code.</w:t>
@@ -2121,7 +2121,7 @@
               <w:jc w:val="left"/>
             </w:pPr>
             <w:r>
-              <w:t xml:space="preserve">228</w:t>
+              <w:t xml:space="preserve">231</w:t>
             </w:r>
           </w:p>
         </w:tc>
@@ -17428,7 +17428,7 @@
         <w:t xml:space="preserve"> </w:t>
       </w:r>
       <w:r>
-        <w:t xml:space="preserve">column says which) the repository holds a cell-level plan (excel_ai/legacy/bugfixes/data, JSON): for each cell the formula now, the new formula, the range to fill and the policy row. Apply a plan as stage F above: type the new formula in the cell, fill the range, copy the baseline cells onto the policy row given (Paste Special, Formulas), recalculate, then run T1-T7. The plans are printed with each bug in Legacy_CPAT_Bugs_v1.0.3.docx.</w:t>
+        <w:t xml:space="preserve">column says which) the repository holds a cell-level plan (excel_ai/legacy/bugfixes/data, JSON): for each cell the formula now, the new formula, the range to fill and the policy row. Apply a plan as stage F above: type the new formula in the cell, fill the range, copy the baseline cells onto the policy row given (Paste Special, Formulas), recalculate, then run T1-T7. The plans are printed with each bug in Legacy_CPAT_Bugs_v1.0.4.docx.</w:t>
       </w:r>
     </w:p>
     <w:p>

</xml_diff>